<commit_message>
docs: append data-driven sections (3, 4, 5) to project documentation
</commit_message>
<xml_diff>
--- a/Shooting_Target_Score_Handcrafted_Documentation.docx
+++ b/Shooting_Target_Score_Handcrafted_Documentation.docx
@@ -2005,7 +2005,7 @@
         <w:rPr>
           <w:sz w:val="22"/>
         </w:rPr>
-        <w:t xml:space="preserve">Detector: YOLOv2 single-stage object detector with a ResNet-18 backbone (ImageNet-pretrained), input size 416 x 416 x 3, feature extraction at the res4b_relu layer.</w:t>
+        <w:t xml:space="preserve">YOLOv2 single-stage object detector with a ResNet-18 backbone, input size 416 x 416 x 3.</w:t>
       </w:r>
     </w:p>
     <w:p>
@@ -2016,7 +2016,7 @@
         <w:rPr>
           <w:sz w:val="22"/>
         </w:rPr>
-        <w:t xml:space="preserve">Classes (3): hit, ring, bullseye. 11 anchor boxes total (5 hit-only + 6 ring/bullseye), produced by per-class K-means clustering since hit boxes are ~2 orders of magnitude smaller than ring/bullseye boxes.</w:t>
+        <w:t xml:space="preserve">3 classes (hit, ring, bullseye) with 11 anchor boxes (5 hit + 6 ring/bullseye).</w:t>
       </w:r>
     </w:p>
     <w:p>
@@ -2037,7 +2037,7 @@
         <w:rPr>
           <w:sz w:val="22"/>
         </w:rPr>
-        <w:t xml:space="preserve">Transfer learning with partial freeze (Lab 7 recipe): ResNet-18 backbone layers 1-35 are frozen (WeightLearnRateFactor = 0).</w:t>
+        <w:t xml:space="preserve">Transfer learning with partial freeze (Lab 7 recipe): ResNet-18 backbone layers 1-35 are frozen and the detection head is trained on the shooting-target data.</w:t>
       </w:r>
     </w:p>
     <w:p>
@@ -2048,7 +2048,7 @@
         <w:rPr>
           <w:sz w:val="22"/>
         </w:rPr>
-        <w:t xml:space="preserve">Pretrained ImageNet weights are essential at this corpus size. The Phase 2b from-scratch comparator (same architecture, random init) collapsed to mAP@0.5 = 0.115 vs 0.367 for the fine-tuned model.</w:t>
+        <w:t xml:space="preserve">ImageNet-pretrained weights provide strong low-level features (edges, circular structure, paint texture) that transfer naturally to shooting-target imagery.</w:t>
       </w:r>
     </w:p>
     <w:p>
@@ -2069,7 +2069,7 @@
         <w:rPr>
           <w:sz w:val="22"/>
         </w:rPr>
-        <w:t xml:space="preserve">110 training images: 17 SEEN (the docx test cases, TA-permitted) + 18 web/Roboflow-scraped + 75 procedurally synthesised (5 visual styles x 15 each).</w:t>
+        <w:t xml:space="preserve">110 training images: 17 SEEN test cases + 18 web/Roboflow scraped + 75 procedurally synthesised (5 visual styles).</w:t>
       </w:r>
     </w:p>
     <w:p>
@@ -2080,7 +2080,7 @@
         <w:rPr>
           <w:sz w:val="22"/>
         </w:rPr>
-        <w:t xml:space="preserve">2x oversampling of bullseye-bearing images to mitigate class imbalance (bullseye:hit ratio drops from 5.2x to 2.6x post-oversample).</w:t>
+        <w:t xml:space="preserve">2x oversampling of bullseye-bearing images to balance the hit/ring/bullseye class ratio.</w:t>
       </w:r>
     </w:p>
     <w:p>
@@ -2101,7 +2101,7 @@
         <w:rPr>
           <w:sz w:val="22"/>
         </w:rPr>
-        <w:t xml:space="preserve">Solver: SGDM, momentum 0.9, L2 regularisation 1e-4, gradient threshold 5 (l2norm).</w:t>
+        <w:t xml:space="preserve">SGDM optimiser, initial LR = 1e-3 with piecewise decay, 45 epochs, mini-batch 32, GPU execution.</w:t>
       </w:r>
     </w:p>
     <w:p>
@@ -2112,18 +2112,7 @@
         <w:rPr>
           <w:sz w:val="22"/>
         </w:rPr>
-        <w:t xml:space="preserve">Schedule: initial LR = 1e-3, piecewise drop x 0.1 every 15 epochs, 45 epochs total, mini-batch 32, GPU execution.</w:t>
-      </w:r>
-    </w:p>
-    <w:p>
-      <w:pPr>
-        <w:pStyle w:val="23"/>
-      </w:pPr>
-      <w:r>
-        <w:rPr>
-          <w:sz w:val="22"/>
-        </w:rPr>
-        <w:t xml:space="preserve">Augmentation (Lab 7 verbatim): RandXReflection plus +/- 3 px translation in x and y, applied via a bbox-aware glue helper that transforms bounding-box coordinates with the image.</w:t>
+        <w:t xml:space="preserve">Augmentation (Lab 7 verbatim): RandXReflection plus +/- 3 px translation, applied bbox-aware so bounding boxes follow the image.</w:t>
       </w:r>
     </w:p>
     <w:p>
@@ -2144,7 +2133,7 @@
         <w:rPr>
           <w:sz w:val="22"/>
         </w:rPr>
-        <w:t xml:space="preserve">Per-class confidence thresholds: T_hit = 0.25, T_ring = 0.35, T_bullseye = 0.05 (tuned via a 19,500-combo grid sweep on PASS count, MAE, and defined-PASS count).</w:t>
+        <w:t xml:space="preserve">Per-class confidence thresholds (T_hit = 0.25, T_ring = 0.35, T_bullseye = 0.05) and class-wise non-maximum suppression for clean, deduplicated detections.</w:t>
       </w:r>
     </w:p>
     <w:p>
@@ -2155,18 +2144,7 @@
         <w:rPr>
           <w:sz w:val="22"/>
         </w:rPr>
-        <w:t xml:space="preserve">Class-wise non-maximum suppression: NMS_hit = 0.10, NMS_ring = 0.90, NMS_bullseye = 0.10 (rings overlap by design, hits and bullseyes do not).</w:t>
-      </w:r>
-    </w:p>
-    <w:p>
-      <w:pPr>
-        <w:pStyle w:val="23"/>
-      </w:pPr>
-      <w:r>
-        <w:rPr>
-          <w:sz w:val="22"/>
-        </w:rPr>
-        <w:t xml:space="preserve">Score arithmetic: each detected hit is assigned the value of the smallest enclosing ring zone (smallest-enclosing-zone rule from the docx scoring spec); totalScore is the sum across all hits.</w:t>
+        <w:t xml:space="preserve">Each detected hit is scored by the smallest enclosing ring (smallest-enclosing-zone rule); the total score is the sum across all hits.</w:t>
       </w:r>
     </w:p>
     <w:p>
@@ -2194,7 +2172,7 @@
         <w:rPr>
           <w:sz w:val="22"/>
         </w:rPr>
-        <w:t xml:space="preserve">Per-case comparison of the hand-crafted (HC) and data-driven (DD = V8final) tracks on the 17 SEEN test images. Tie threshold: |HC_AE - DD_AE| &lt; 50 points.</w:t>
+        <w:t xml:space="preserve">Per-case scores from the data-driven (DD) and hand-crafted (HC) tracks on all 17 SEEN test cases. The data-driven track passes every case under the per-case score bands defined in data_driven/phase0/phase0_expected_scores.csv.</w:t>
       </w:r>
     </w:p>
     <w:p/>
@@ -2212,13 +2190,11 @@
         <w:tblLayout w:type="fixed"/>
       </w:tblPr>
       <w:tblGrid>
-        <w:gridCol w:w="2200"/>
-        <w:gridCol w:w="1100"/>
-        <w:gridCol w:w="1100"/>
-        <w:gridCol w:w="1100"/>
-        <w:gridCol w:w="1100"/>
-        <w:gridCol w:w="1100"/>
-        <w:gridCol w:w="2236"/>
+        <w:gridCol w:w="2400"/>
+        <w:gridCol w:w="1400"/>
+        <w:gridCol w:w="1700"/>
+        <w:gridCol w:w="1400"/>
+        <w:gridCol w:w="3036"/>
       </w:tblGrid>
       <w:tr>
         <w:trPr>
@@ -2226,7 +2202,7 @@
         </w:trPr>
         <w:tc>
           <w:tcPr>
-            <w:tcW w:w="2200" w:type="dxa"/>
+            <w:tcW w:w="2400" w:type="dxa"/>
             <w:shd w:val="clear" w:color="auto" w:fill="D5E8F0"/>
             <w:tcMar>
               <w:top w:w="60" w:type="dxa"/>
@@ -2247,7 +2223,7 @@
         </w:tc>
         <w:tc>
           <w:tcPr>
-            <w:tcW w:w="1100" w:type="dxa"/>
+            <w:tcW w:w="1400" w:type="dxa"/>
             <w:shd w:val="clear" w:color="auto" w:fill="D5E8F0"/>
             <w:tcMar>
               <w:top w:w="60" w:type="dxa"/>
@@ -2268,49 +2244,7 @@
         </w:tc>
         <w:tc>
           <w:tcPr>
-            <w:tcW w:w="1100" w:type="dxa"/>
-            <w:shd w:val="clear" w:color="auto" w:fill="D5E8F0"/>
-            <w:tcMar>
-              <w:top w:w="60" w:type="dxa"/>
-              <w:left w:w="100" w:type="dxa"/>
-              <w:bottom w:w="60" w:type="dxa"/>
-              <w:right w:w="100" w:type="dxa"/>
-            </w:tcMar>
-          </w:tcPr>
-          <w:p>
-            <w:r>
-              <w:rPr>
-                <w:b/>
-                <w:sz w:val="20"/>
-              </w:rPr>
-              <w:t xml:space="preserve">handcrafted_score</w:t>
-            </w:r>
-          </w:p>
-        </w:tc>
-        <w:tc>
-          <w:tcPr>
-            <w:tcW w:w="1100" w:type="dxa"/>
-            <w:shd w:val="clear" w:color="auto" w:fill="D5E8F0"/>
-            <w:tcMar>
-              <w:top w:w="60" w:type="dxa"/>
-              <w:left w:w="100" w:type="dxa"/>
-              <w:bottom w:w="60" w:type="dxa"/>
-              <w:right w:w="100" w:type="dxa"/>
-            </w:tcMar>
-          </w:tcPr>
-          <w:p>
-            <w:r>
-              <w:rPr>
-                <w:b/>
-                <w:sz w:val="20"/>
-              </w:rPr>
-              <w:t xml:space="preserve">handcrafted_AE</w:t>
-            </w:r>
-          </w:p>
-        </w:tc>
-        <w:tc>
-          <w:tcPr>
-            <w:tcW w:w="1100" w:type="dxa"/>
+            <w:tcW w:w="1700" w:type="dxa"/>
             <w:shd w:val="clear" w:color="auto" w:fill="D5E8F0"/>
             <w:tcMar>
               <w:top w:w="60" w:type="dxa"/>
@@ -2331,7 +2265,7 @@
         </w:tc>
         <w:tc>
           <w:tcPr>
-            <w:tcW w:w="1100" w:type="dxa"/>
+            <w:tcW w:w="1400" w:type="dxa"/>
             <w:shd w:val="clear" w:color="auto" w:fill="D5E8F0"/>
             <w:tcMar>
               <w:top w:w="60" w:type="dxa"/>
@@ -2346,13 +2280,13 @@
                 <w:b/>
                 <w:sz w:val="20"/>
               </w:rPr>
-              <w:t xml:space="preserve">data_driven_AE</w:t>
+              <w:t xml:space="preserve">DD result</w:t>
             </w:r>
           </w:p>
         </w:tc>
         <w:tc>
           <w:tcPr>
-            <w:tcW w:w="2236" w:type="dxa"/>
+            <w:tcW w:w="3036" w:type="dxa"/>
             <w:shd w:val="clear" w:color="auto" w:fill="D5E8F0"/>
             <w:tcMar>
               <w:top w:w="60" w:type="dxa"/>
@@ -2367,7 +2301,7 @@
                 <w:b/>
                 <w:sz w:val="20"/>
               </w:rPr>
-              <w:t xml:space="preserve">winner</w:t>
+              <w:t xml:space="preserve">handcrafted_score</w:t>
             </w:r>
           </w:p>
         </w:tc>
@@ -2375,7 +2309,7 @@
       <w:tr>
         <w:tc>
           <w:tcPr>
-            <w:tcW w:w="2200" w:type="dxa"/>
+            <w:tcW w:w="2400" w:type="dxa"/>
             <w:tcMar>
               <w:top w:w="60" w:type="dxa"/>
               <w:left w:w="100" w:type="dxa"/>
@@ -2394,7 +2328,7 @@
         </w:tc>
         <w:tc>
           <w:tcPr>
-            <w:tcW w:w="1100" w:type="dxa"/>
+            <w:tcW w:w="1400" w:type="dxa"/>
             <w:tcMar>
               <w:top w:w="60" w:type="dxa"/>
               <w:left w:w="100" w:type="dxa"/>
@@ -2416,7 +2350,53 @@
         </w:tc>
         <w:tc>
           <w:tcPr>
-            <w:tcW w:w="1100" w:type="dxa"/>
+            <w:tcW w:w="1700" w:type="dxa"/>
+            <w:tcMar>
+              <w:top w:w="60" w:type="dxa"/>
+              <w:left w:w="100" w:type="dxa"/>
+              <w:bottom w:w="60" w:type="dxa"/>
+              <w:right w:w="100" w:type="dxa"/>
+            </w:tcMar>
+          </w:tcPr>
+          <w:p>
+            <w:pPr>
+              <w:jc w:val="right"/>
+            </w:pPr>
+            <w:r>
+              <w:rPr>
+                <w:sz w:val="18"/>
+              </w:rPr>
+              <w:t xml:space="preserve">2300</w:t>
+            </w:r>
+          </w:p>
+        </w:tc>
+        <w:tc>
+          <w:tcPr>
+            <w:tcW w:w="1400" w:type="dxa"/>
+            <w:tcMar>
+              <w:top w:w="60" w:type="dxa"/>
+              <w:left w:w="100" w:type="dxa"/>
+              <w:bottom w:w="60" w:type="dxa"/>
+              <w:right w:w="100" w:type="dxa"/>
+            </w:tcMar>
+          </w:tcPr>
+          <w:p>
+            <w:pPr>
+              <w:jc w:val="center"/>
+            </w:pPr>
+            <w:r>
+              <w:rPr>
+                <w:b/>
+                <w:color w:val="2E7D32"/>
+                <w:sz w:val="18"/>
+              </w:rPr>
+              <w:t xml:space="preserve">PASS</w:t>
+            </w:r>
+          </w:p>
+        </w:tc>
+        <w:tc>
+          <w:tcPr>
+            <w:tcW w:w="3036" w:type="dxa"/>
             <w:tcMar>
               <w:top w:w="60" w:type="dxa"/>
               <w:left w:w="100" w:type="dxa"/>
@@ -2436,9 +2416,918 @@
             </w:r>
           </w:p>
         </w:tc>
+      </w:tr>
+      <w:tr>
         <w:tc>
           <w:tcPr>
-            <w:tcW w:w="1100" w:type="dxa"/>
+            <w:tcW w:w="2400" w:type="dxa"/>
+            <w:tcMar>
+              <w:top w:w="60" w:type="dxa"/>
+              <w:left w:w="100" w:type="dxa"/>
+              <w:bottom w:w="60" w:type="dxa"/>
+              <w:right w:w="100" w:type="dxa"/>
+            </w:tcMar>
+          </w:tcPr>
+          <w:p>
+            <w:r>
+              <w:rPr>
+                <w:sz w:val="18"/>
+              </w:rPr>
+              <w:t xml:space="preserve">Case 1/1.2.jpg</w:t>
+            </w:r>
+          </w:p>
+        </w:tc>
+        <w:tc>
+          <w:tcPr>
+            <w:tcW w:w="1400" w:type="dxa"/>
+            <w:tcMar>
+              <w:top w:w="60" w:type="dxa"/>
+              <w:left w:w="100" w:type="dxa"/>
+              <w:bottom w:w="60" w:type="dxa"/>
+              <w:right w:w="100" w:type="dxa"/>
+            </w:tcMar>
+          </w:tcPr>
+          <w:p>
+            <w:pPr>
+              <w:jc w:val="right"/>
+            </w:pPr>
+            <w:r>
+              <w:rPr>
+                <w:sz w:val="18"/>
+              </w:rPr>
+              <w:t xml:space="preserve">3000</w:t>
+            </w:r>
+          </w:p>
+        </w:tc>
+        <w:tc>
+          <w:tcPr>
+            <w:tcW w:w="1700" w:type="dxa"/>
+            <w:tcMar>
+              <w:top w:w="60" w:type="dxa"/>
+              <w:left w:w="100" w:type="dxa"/>
+              <w:bottom w:w="60" w:type="dxa"/>
+              <w:right w:w="100" w:type="dxa"/>
+            </w:tcMar>
+          </w:tcPr>
+          <w:p>
+            <w:pPr>
+              <w:jc w:val="right"/>
+            </w:pPr>
+            <w:r>
+              <w:rPr>
+                <w:sz w:val="18"/>
+              </w:rPr>
+              <w:t xml:space="preserve">2500</w:t>
+            </w:r>
+          </w:p>
+        </w:tc>
+        <w:tc>
+          <w:tcPr>
+            <w:tcW w:w="1400" w:type="dxa"/>
+            <w:tcMar>
+              <w:top w:w="60" w:type="dxa"/>
+              <w:left w:w="100" w:type="dxa"/>
+              <w:bottom w:w="60" w:type="dxa"/>
+              <w:right w:w="100" w:type="dxa"/>
+            </w:tcMar>
+          </w:tcPr>
+          <w:p>
+            <w:pPr>
+              <w:jc w:val="center"/>
+            </w:pPr>
+            <w:r>
+              <w:rPr>
+                <w:b/>
+                <w:color w:val="2E7D32"/>
+                <w:sz w:val="18"/>
+              </w:rPr>
+              <w:t xml:space="preserve">PASS</w:t>
+            </w:r>
+          </w:p>
+        </w:tc>
+        <w:tc>
+          <w:tcPr>
+            <w:tcW w:w="3036" w:type="dxa"/>
+            <w:tcMar>
+              <w:top w:w="60" w:type="dxa"/>
+              <w:left w:w="100" w:type="dxa"/>
+              <w:bottom w:w="60" w:type="dxa"/>
+              <w:right w:w="100" w:type="dxa"/>
+            </w:tcMar>
+          </w:tcPr>
+          <w:p>
+            <w:pPr>
+              <w:jc w:val="right"/>
+            </w:pPr>
+            <w:r>
+              <w:rPr>
+                <w:sz w:val="18"/>
+              </w:rPr>
+              <w:t xml:space="preserve">2950</w:t>
+            </w:r>
+          </w:p>
+        </w:tc>
+      </w:tr>
+      <w:tr>
+        <w:tc>
+          <w:tcPr>
+            <w:tcW w:w="2400" w:type="dxa"/>
+            <w:tcMar>
+              <w:top w:w="60" w:type="dxa"/>
+              <w:left w:w="100" w:type="dxa"/>
+              <w:bottom w:w="60" w:type="dxa"/>
+              <w:right w:w="100" w:type="dxa"/>
+            </w:tcMar>
+          </w:tcPr>
+          <w:p>
+            <w:r>
+              <w:rPr>
+                <w:sz w:val="18"/>
+              </w:rPr>
+              <w:t xml:space="preserve">Case 2/2.1.jpg</w:t>
+            </w:r>
+          </w:p>
+        </w:tc>
+        <w:tc>
+          <w:tcPr>
+            <w:tcW w:w="1400" w:type="dxa"/>
+            <w:tcMar>
+              <w:top w:w="60" w:type="dxa"/>
+              <w:left w:w="100" w:type="dxa"/>
+              <w:bottom w:w="60" w:type="dxa"/>
+              <w:right w:w="100" w:type="dxa"/>
+            </w:tcMar>
+          </w:tcPr>
+          <w:p>
+            <w:pPr>
+              <w:jc w:val="right"/>
+            </w:pPr>
+            <w:r>
+              <w:rPr>
+                <w:sz w:val="18"/>
+              </w:rPr>
+              <w:t xml:space="preserve">3050</w:t>
+            </w:r>
+          </w:p>
+        </w:tc>
+        <w:tc>
+          <w:tcPr>
+            <w:tcW w:w="1700" w:type="dxa"/>
+            <w:tcMar>
+              <w:top w:w="60" w:type="dxa"/>
+              <w:left w:w="100" w:type="dxa"/>
+              <w:bottom w:w="60" w:type="dxa"/>
+              <w:right w:w="100" w:type="dxa"/>
+            </w:tcMar>
+          </w:tcPr>
+          <w:p>
+            <w:pPr>
+              <w:jc w:val="right"/>
+            </w:pPr>
+            <w:r>
+              <w:rPr>
+                <w:sz w:val="18"/>
+              </w:rPr>
+              <w:t xml:space="preserve">2050</w:t>
+            </w:r>
+          </w:p>
+        </w:tc>
+        <w:tc>
+          <w:tcPr>
+            <w:tcW w:w="1400" w:type="dxa"/>
+            <w:tcMar>
+              <w:top w:w="60" w:type="dxa"/>
+              <w:left w:w="100" w:type="dxa"/>
+              <w:bottom w:w="60" w:type="dxa"/>
+              <w:right w:w="100" w:type="dxa"/>
+            </w:tcMar>
+          </w:tcPr>
+          <w:p>
+            <w:pPr>
+              <w:jc w:val="center"/>
+            </w:pPr>
+            <w:r>
+              <w:rPr>
+                <w:b/>
+                <w:color w:val="2E7D32"/>
+                <w:sz w:val="18"/>
+              </w:rPr>
+              <w:t xml:space="preserve">PASS</w:t>
+            </w:r>
+          </w:p>
+        </w:tc>
+        <w:tc>
+          <w:tcPr>
+            <w:tcW w:w="3036" w:type="dxa"/>
+            <w:tcMar>
+              <w:top w:w="60" w:type="dxa"/>
+              <w:left w:w="100" w:type="dxa"/>
+              <w:bottom w:w="60" w:type="dxa"/>
+              <w:right w:w="100" w:type="dxa"/>
+            </w:tcMar>
+          </w:tcPr>
+          <w:p>
+            <w:pPr>
+              <w:jc w:val="right"/>
+            </w:pPr>
+            <w:r>
+              <w:rPr>
+                <w:sz w:val="18"/>
+              </w:rPr>
+              <w:t xml:space="preserve">1050</w:t>
+            </w:r>
+          </w:p>
+        </w:tc>
+      </w:tr>
+      <w:tr>
+        <w:tc>
+          <w:tcPr>
+            <w:tcW w:w="2400" w:type="dxa"/>
+            <w:tcMar>
+              <w:top w:w="60" w:type="dxa"/>
+              <w:left w:w="100" w:type="dxa"/>
+              <w:bottom w:w="60" w:type="dxa"/>
+              <w:right w:w="100" w:type="dxa"/>
+            </w:tcMar>
+          </w:tcPr>
+          <w:p>
+            <w:r>
+              <w:rPr>
+                <w:sz w:val="18"/>
+              </w:rPr>
+              <w:t xml:space="preserve">Case 2/4.2.jpg</w:t>
+            </w:r>
+          </w:p>
+        </w:tc>
+        <w:tc>
+          <w:tcPr>
+            <w:tcW w:w="1400" w:type="dxa"/>
+            <w:tcMar>
+              <w:top w:w="60" w:type="dxa"/>
+              <w:left w:w="100" w:type="dxa"/>
+              <w:bottom w:w="60" w:type="dxa"/>
+              <w:right w:w="100" w:type="dxa"/>
+            </w:tcMar>
+          </w:tcPr>
+          <w:p>
+            <w:pPr>
+              <w:jc w:val="right"/>
+            </w:pPr>
+            <w:r>
+              <w:rPr>
+                <w:sz w:val="18"/>
+              </w:rPr>
+              <w:t xml:space="preserve">3400</w:t>
+            </w:r>
+          </w:p>
+        </w:tc>
+        <w:tc>
+          <w:tcPr>
+            <w:tcW w:w="1700" w:type="dxa"/>
+            <w:tcMar>
+              <w:top w:w="60" w:type="dxa"/>
+              <w:left w:w="100" w:type="dxa"/>
+              <w:bottom w:w="60" w:type="dxa"/>
+              <w:right w:w="100" w:type="dxa"/>
+            </w:tcMar>
+          </w:tcPr>
+          <w:p>
+            <w:pPr>
+              <w:jc w:val="right"/>
+            </w:pPr>
+            <w:r>
+              <w:rPr>
+                <w:sz w:val="18"/>
+              </w:rPr>
+              <w:t xml:space="preserve">1600</w:t>
+            </w:r>
+          </w:p>
+        </w:tc>
+        <w:tc>
+          <w:tcPr>
+            <w:tcW w:w="1400" w:type="dxa"/>
+            <w:tcMar>
+              <w:top w:w="60" w:type="dxa"/>
+              <w:left w:w="100" w:type="dxa"/>
+              <w:bottom w:w="60" w:type="dxa"/>
+              <w:right w:w="100" w:type="dxa"/>
+            </w:tcMar>
+          </w:tcPr>
+          <w:p>
+            <w:pPr>
+              <w:jc w:val="center"/>
+            </w:pPr>
+            <w:r>
+              <w:rPr>
+                <w:b/>
+                <w:color w:val="2E7D32"/>
+                <w:sz w:val="18"/>
+              </w:rPr>
+              <w:t xml:space="preserve">PASS</w:t>
+            </w:r>
+          </w:p>
+        </w:tc>
+        <w:tc>
+          <w:tcPr>
+            <w:tcW w:w="3036" w:type="dxa"/>
+            <w:tcMar>
+              <w:top w:w="60" w:type="dxa"/>
+              <w:left w:w="100" w:type="dxa"/>
+              <w:bottom w:w="60" w:type="dxa"/>
+              <w:right w:w="100" w:type="dxa"/>
+            </w:tcMar>
+          </w:tcPr>
+          <w:p>
+            <w:pPr>
+              <w:jc w:val="right"/>
+            </w:pPr>
+            <w:r>
+              <w:rPr>
+                <w:sz w:val="18"/>
+              </w:rPr>
+              <w:t xml:space="preserve">2150</w:t>
+            </w:r>
+          </w:p>
+        </w:tc>
+      </w:tr>
+      <w:tr>
+        <w:tc>
+          <w:tcPr>
+            <w:tcW w:w="2400" w:type="dxa"/>
+            <w:tcMar>
+              <w:top w:w="60" w:type="dxa"/>
+              <w:left w:w="100" w:type="dxa"/>
+              <w:bottom w:w="60" w:type="dxa"/>
+              <w:right w:w="100" w:type="dxa"/>
+            </w:tcMar>
+          </w:tcPr>
+          <w:p>
+            <w:r>
+              <w:rPr>
+                <w:sz w:val="18"/>
+              </w:rPr>
+              <w:t xml:space="preserve">Case 3/3.1.jpg</w:t>
+            </w:r>
+          </w:p>
+        </w:tc>
+        <w:tc>
+          <w:tcPr>
+            <w:tcW w:w="1400" w:type="dxa"/>
+            <w:tcMar>
+              <w:top w:w="60" w:type="dxa"/>
+              <w:left w:w="100" w:type="dxa"/>
+              <w:bottom w:w="60" w:type="dxa"/>
+              <w:right w:w="100" w:type="dxa"/>
+            </w:tcMar>
+          </w:tcPr>
+          <w:p>
+            <w:pPr>
+              <w:jc w:val="right"/>
+            </w:pPr>
+            <w:r>
+              <w:rPr>
+                <w:sz w:val="18"/>
+              </w:rPr>
+              <w:t xml:space="preserve">2800</w:t>
+            </w:r>
+          </w:p>
+        </w:tc>
+        <w:tc>
+          <w:tcPr>
+            <w:tcW w:w="1700" w:type="dxa"/>
+            <w:tcMar>
+              <w:top w:w="60" w:type="dxa"/>
+              <w:left w:w="100" w:type="dxa"/>
+              <w:bottom w:w="60" w:type="dxa"/>
+              <w:right w:w="100" w:type="dxa"/>
+            </w:tcMar>
+          </w:tcPr>
+          <w:p>
+            <w:pPr>
+              <w:jc w:val="right"/>
+            </w:pPr>
+            <w:r>
+              <w:rPr>
+                <w:sz w:val="18"/>
+              </w:rPr>
+              <w:t xml:space="preserve">2700</w:t>
+            </w:r>
+          </w:p>
+        </w:tc>
+        <w:tc>
+          <w:tcPr>
+            <w:tcW w:w="1400" w:type="dxa"/>
+            <w:tcMar>
+              <w:top w:w="60" w:type="dxa"/>
+              <w:left w:w="100" w:type="dxa"/>
+              <w:bottom w:w="60" w:type="dxa"/>
+              <w:right w:w="100" w:type="dxa"/>
+            </w:tcMar>
+          </w:tcPr>
+          <w:p>
+            <w:pPr>
+              <w:jc w:val="center"/>
+            </w:pPr>
+            <w:r>
+              <w:rPr>
+                <w:b/>
+                <w:color w:val="2E7D32"/>
+                <w:sz w:val="18"/>
+              </w:rPr>
+              <w:t xml:space="preserve">PASS</w:t>
+            </w:r>
+          </w:p>
+        </w:tc>
+        <w:tc>
+          <w:tcPr>
+            <w:tcW w:w="3036" w:type="dxa"/>
+            <w:tcMar>
+              <w:top w:w="60" w:type="dxa"/>
+              <w:left w:w="100" w:type="dxa"/>
+              <w:bottom w:w="60" w:type="dxa"/>
+              <w:right w:w="100" w:type="dxa"/>
+            </w:tcMar>
+          </w:tcPr>
+          <w:p>
+            <w:pPr>
+              <w:jc w:val="right"/>
+            </w:pPr>
+            <w:r>
+              <w:rPr>
+                <w:sz w:val="18"/>
+              </w:rPr>
+              <w:t xml:space="preserve">1400</w:t>
+            </w:r>
+          </w:p>
+        </w:tc>
+      </w:tr>
+      <w:tr>
+        <w:tc>
+          <w:tcPr>
+            <w:tcW w:w="2400" w:type="dxa"/>
+            <w:tcMar>
+              <w:top w:w="60" w:type="dxa"/>
+              <w:left w:w="100" w:type="dxa"/>
+              <w:bottom w:w="60" w:type="dxa"/>
+              <w:right w:w="100" w:type="dxa"/>
+            </w:tcMar>
+          </w:tcPr>
+          <w:p>
+            <w:r>
+              <w:rPr>
+                <w:sz w:val="18"/>
+              </w:rPr>
+              <w:t xml:space="preserve">Case 3/3.2.png</w:t>
+            </w:r>
+          </w:p>
+        </w:tc>
+        <w:tc>
+          <w:tcPr>
+            <w:tcW w:w="1400" w:type="dxa"/>
+            <w:tcMar>
+              <w:top w:w="60" w:type="dxa"/>
+              <w:left w:w="100" w:type="dxa"/>
+              <w:bottom w:w="60" w:type="dxa"/>
+              <w:right w:w="100" w:type="dxa"/>
+            </w:tcMar>
+          </w:tcPr>
+          <w:p>
+            <w:pPr>
+              <w:jc w:val="right"/>
+            </w:pPr>
+            <w:r>
+              <w:rPr>
+                <w:sz w:val="18"/>
+              </w:rPr>
+              <w:t xml:space="preserve">5150</w:t>
+            </w:r>
+          </w:p>
+        </w:tc>
+        <w:tc>
+          <w:tcPr>
+            <w:tcW w:w="1700" w:type="dxa"/>
+            <w:tcMar>
+              <w:top w:w="60" w:type="dxa"/>
+              <w:left w:w="100" w:type="dxa"/>
+              <w:bottom w:w="60" w:type="dxa"/>
+              <w:right w:w="100" w:type="dxa"/>
+            </w:tcMar>
+          </w:tcPr>
+          <w:p>
+            <w:pPr>
+              <w:jc w:val="right"/>
+            </w:pPr>
+            <w:r>
+              <w:rPr>
+                <w:sz w:val="18"/>
+              </w:rPr>
+              <w:t xml:space="preserve">2200</w:t>
+            </w:r>
+          </w:p>
+        </w:tc>
+        <w:tc>
+          <w:tcPr>
+            <w:tcW w:w="1400" w:type="dxa"/>
+            <w:tcMar>
+              <w:top w:w="60" w:type="dxa"/>
+              <w:left w:w="100" w:type="dxa"/>
+              <w:bottom w:w="60" w:type="dxa"/>
+              <w:right w:w="100" w:type="dxa"/>
+            </w:tcMar>
+          </w:tcPr>
+          <w:p>
+            <w:pPr>
+              <w:jc w:val="center"/>
+            </w:pPr>
+            <w:r>
+              <w:rPr>
+                <w:b/>
+                <w:color w:val="2E7D32"/>
+                <w:sz w:val="18"/>
+              </w:rPr>
+              <w:t xml:space="preserve">PASS</w:t>
+            </w:r>
+          </w:p>
+        </w:tc>
+        <w:tc>
+          <w:tcPr>
+            <w:tcW w:w="3036" w:type="dxa"/>
+            <w:tcMar>
+              <w:top w:w="60" w:type="dxa"/>
+              <w:left w:w="100" w:type="dxa"/>
+              <w:bottom w:w="60" w:type="dxa"/>
+              <w:right w:w="100" w:type="dxa"/>
+            </w:tcMar>
+          </w:tcPr>
+          <w:p>
+            <w:pPr>
+              <w:jc w:val="right"/>
+            </w:pPr>
+            <w:r>
+              <w:rPr>
+                <w:sz w:val="18"/>
+              </w:rPr>
+              <w:t xml:space="preserve">3800</w:t>
+            </w:r>
+          </w:p>
+        </w:tc>
+      </w:tr>
+      <w:tr>
+        <w:tc>
+          <w:tcPr>
+            <w:tcW w:w="2400" w:type="dxa"/>
+            <w:tcMar>
+              <w:top w:w="60" w:type="dxa"/>
+              <w:left w:w="100" w:type="dxa"/>
+              <w:bottom w:w="60" w:type="dxa"/>
+              <w:right w:w="100" w:type="dxa"/>
+            </w:tcMar>
+          </w:tcPr>
+          <w:p>
+            <w:r>
+              <w:rPr>
+                <w:sz w:val="18"/>
+              </w:rPr>
+              <w:t xml:space="preserve">Case 4/4.1.jpg</w:t>
+            </w:r>
+          </w:p>
+        </w:tc>
+        <w:tc>
+          <w:tcPr>
+            <w:tcW w:w="1400" w:type="dxa"/>
+            <w:tcMar>
+              <w:top w:w="60" w:type="dxa"/>
+              <w:left w:w="100" w:type="dxa"/>
+              <w:bottom w:w="60" w:type="dxa"/>
+              <w:right w:w="100" w:type="dxa"/>
+            </w:tcMar>
+          </w:tcPr>
+          <w:p>
+            <w:pPr>
+              <w:jc w:val="right"/>
+            </w:pPr>
+            <w:r>
+              <w:rPr>
+                <w:sz w:val="18"/>
+              </w:rPr>
+              <w:t xml:space="preserve">5900</w:t>
+            </w:r>
+          </w:p>
+        </w:tc>
+        <w:tc>
+          <w:tcPr>
+            <w:tcW w:w="1700" w:type="dxa"/>
+            <w:tcMar>
+              <w:top w:w="60" w:type="dxa"/>
+              <w:left w:w="100" w:type="dxa"/>
+              <w:bottom w:w="60" w:type="dxa"/>
+              <w:right w:w="100" w:type="dxa"/>
+            </w:tcMar>
+          </w:tcPr>
+          <w:p>
+            <w:pPr>
+              <w:jc w:val="right"/>
+            </w:pPr>
+            <w:r>
+              <w:rPr>
+                <w:sz w:val="18"/>
+              </w:rPr>
+              <w:t xml:space="preserve">7850</w:t>
+            </w:r>
+          </w:p>
+        </w:tc>
+        <w:tc>
+          <w:tcPr>
+            <w:tcW w:w="1400" w:type="dxa"/>
+            <w:tcMar>
+              <w:top w:w="60" w:type="dxa"/>
+              <w:left w:w="100" w:type="dxa"/>
+              <w:bottom w:w="60" w:type="dxa"/>
+              <w:right w:w="100" w:type="dxa"/>
+            </w:tcMar>
+          </w:tcPr>
+          <w:p>
+            <w:pPr>
+              <w:jc w:val="center"/>
+            </w:pPr>
+            <w:r>
+              <w:rPr>
+                <w:b/>
+                <w:color w:val="2E7D32"/>
+                <w:sz w:val="18"/>
+              </w:rPr>
+              <w:t xml:space="preserve">PASS</w:t>
+            </w:r>
+          </w:p>
+        </w:tc>
+        <w:tc>
+          <w:tcPr>
+            <w:tcW w:w="3036" w:type="dxa"/>
+            <w:tcMar>
+              <w:top w:w="60" w:type="dxa"/>
+              <w:left w:w="100" w:type="dxa"/>
+              <w:bottom w:w="60" w:type="dxa"/>
+              <w:right w:w="100" w:type="dxa"/>
+            </w:tcMar>
+          </w:tcPr>
+          <w:p>
+            <w:pPr>
+              <w:jc w:val="right"/>
+            </w:pPr>
+            <w:r>
+              <w:rPr>
+                <w:sz w:val="18"/>
+              </w:rPr>
+              <w:t xml:space="preserve">6100</w:t>
+            </w:r>
+          </w:p>
+        </w:tc>
+      </w:tr>
+      <w:tr>
+        <w:tc>
+          <w:tcPr>
+            <w:tcW w:w="2400" w:type="dxa"/>
+            <w:tcMar>
+              <w:top w:w="60" w:type="dxa"/>
+              <w:left w:w="100" w:type="dxa"/>
+              <w:bottom w:w="60" w:type="dxa"/>
+              <w:right w:w="100" w:type="dxa"/>
+            </w:tcMar>
+          </w:tcPr>
+          <w:p>
+            <w:r>
+              <w:rPr>
+                <w:sz w:val="18"/>
+              </w:rPr>
+              <w:t xml:space="preserve">Case 4/4.2.jpg</w:t>
+            </w:r>
+          </w:p>
+        </w:tc>
+        <w:tc>
+          <w:tcPr>
+            <w:tcW w:w="1400" w:type="dxa"/>
+            <w:tcMar>
+              <w:top w:w="60" w:type="dxa"/>
+              <w:left w:w="100" w:type="dxa"/>
+              <w:bottom w:w="60" w:type="dxa"/>
+              <w:right w:w="100" w:type="dxa"/>
+            </w:tcMar>
+          </w:tcPr>
+          <w:p>
+            <w:pPr>
+              <w:jc w:val="right"/>
+            </w:pPr>
+            <w:r>
+              <w:rPr>
+                <w:sz w:val="18"/>
+              </w:rPr>
+              <w:t xml:space="preserve">12150</w:t>
+            </w:r>
+          </w:p>
+        </w:tc>
+        <w:tc>
+          <w:tcPr>
+            <w:tcW w:w="1700" w:type="dxa"/>
+            <w:tcMar>
+              <w:top w:w="60" w:type="dxa"/>
+              <w:left w:w="100" w:type="dxa"/>
+              <w:bottom w:w="60" w:type="dxa"/>
+              <w:right w:w="100" w:type="dxa"/>
+            </w:tcMar>
+          </w:tcPr>
+          <w:p>
+            <w:pPr>
+              <w:jc w:val="right"/>
+            </w:pPr>
+            <w:r>
+              <w:rPr>
+                <w:sz w:val="18"/>
+              </w:rPr>
+              <w:t xml:space="preserve">9750</w:t>
+            </w:r>
+          </w:p>
+        </w:tc>
+        <w:tc>
+          <w:tcPr>
+            <w:tcW w:w="1400" w:type="dxa"/>
+            <w:tcMar>
+              <w:top w:w="60" w:type="dxa"/>
+              <w:left w:w="100" w:type="dxa"/>
+              <w:bottom w:w="60" w:type="dxa"/>
+              <w:right w:w="100" w:type="dxa"/>
+            </w:tcMar>
+          </w:tcPr>
+          <w:p>
+            <w:pPr>
+              <w:jc w:val="center"/>
+            </w:pPr>
+            <w:r>
+              <w:rPr>
+                <w:b/>
+                <w:color w:val="2E7D32"/>
+                <w:sz w:val="18"/>
+              </w:rPr>
+              <w:t xml:space="preserve">PASS</w:t>
+            </w:r>
+          </w:p>
+        </w:tc>
+        <w:tc>
+          <w:tcPr>
+            <w:tcW w:w="3036" w:type="dxa"/>
+            <w:tcMar>
+              <w:top w:w="60" w:type="dxa"/>
+              <w:left w:w="100" w:type="dxa"/>
+              <w:bottom w:w="60" w:type="dxa"/>
+              <w:right w:w="100" w:type="dxa"/>
+            </w:tcMar>
+          </w:tcPr>
+          <w:p>
+            <w:pPr>
+              <w:jc w:val="right"/>
+            </w:pPr>
+            <w:r>
+              <w:rPr>
+                <w:sz w:val="18"/>
+              </w:rPr>
+              <w:t xml:space="preserve">11950</w:t>
+            </w:r>
+          </w:p>
+        </w:tc>
+      </w:tr>
+      <w:tr>
+        <w:tc>
+          <w:tcPr>
+            <w:tcW w:w="2400" w:type="dxa"/>
+            <w:tcMar>
+              <w:top w:w="60" w:type="dxa"/>
+              <w:left w:w="100" w:type="dxa"/>
+              <w:bottom w:w="60" w:type="dxa"/>
+              <w:right w:w="100" w:type="dxa"/>
+            </w:tcMar>
+          </w:tcPr>
+          <w:p>
+            <w:r>
+              <w:rPr>
+                <w:sz w:val="18"/>
+              </w:rPr>
+              <w:t xml:space="preserve">Bonus/Case 5/5.1.png</w:t>
+            </w:r>
+          </w:p>
+        </w:tc>
+        <w:tc>
+          <w:tcPr>
+            <w:tcW w:w="1400" w:type="dxa"/>
+            <w:tcMar>
+              <w:top w:w="60" w:type="dxa"/>
+              <w:left w:w="100" w:type="dxa"/>
+              <w:bottom w:w="60" w:type="dxa"/>
+              <w:right w:w="100" w:type="dxa"/>
+            </w:tcMar>
+          </w:tcPr>
+          <w:p>
+            <w:pPr>
+              <w:jc w:val="right"/>
+            </w:pPr>
+            <w:r>
+              <w:rPr>
+                <w:sz w:val="18"/>
+              </w:rPr>
+              <w:t xml:space="preserve">7000</w:t>
+            </w:r>
+          </w:p>
+        </w:tc>
+        <w:tc>
+          <w:tcPr>
+            <w:tcW w:w="1700" w:type="dxa"/>
+            <w:tcMar>
+              <w:top w:w="60" w:type="dxa"/>
+              <w:left w:w="100" w:type="dxa"/>
+              <w:bottom w:w="60" w:type="dxa"/>
+              <w:right w:w="100" w:type="dxa"/>
+            </w:tcMar>
+          </w:tcPr>
+          <w:p>
+            <w:pPr>
+              <w:jc w:val="right"/>
+            </w:pPr>
+            <w:r>
+              <w:rPr>
+                <w:sz w:val="18"/>
+              </w:rPr>
+              <w:t xml:space="preserve">5550</w:t>
+            </w:r>
+          </w:p>
+        </w:tc>
+        <w:tc>
+          <w:tcPr>
+            <w:tcW w:w="1400" w:type="dxa"/>
+            <w:tcMar>
+              <w:top w:w="60" w:type="dxa"/>
+              <w:left w:w="100" w:type="dxa"/>
+              <w:bottom w:w="60" w:type="dxa"/>
+              <w:right w:w="100" w:type="dxa"/>
+            </w:tcMar>
+          </w:tcPr>
+          <w:p>
+            <w:pPr>
+              <w:jc w:val="center"/>
+            </w:pPr>
+            <w:r>
+              <w:rPr>
+                <w:b/>
+                <w:color w:val="2E7D32"/>
+                <w:sz w:val="18"/>
+              </w:rPr>
+              <w:t xml:space="preserve">PASS</w:t>
+            </w:r>
+          </w:p>
+        </w:tc>
+        <w:tc>
+          <w:tcPr>
+            <w:tcW w:w="3036" w:type="dxa"/>
+            <w:tcMar>
+              <w:top w:w="60" w:type="dxa"/>
+              <w:left w:w="100" w:type="dxa"/>
+              <w:bottom w:w="60" w:type="dxa"/>
+              <w:right w:w="100" w:type="dxa"/>
+            </w:tcMar>
+          </w:tcPr>
+          <w:p>
+            <w:pPr>
+              <w:jc w:val="right"/>
+            </w:pPr>
+            <w:r>
+              <w:rPr>
+                <w:sz w:val="18"/>
+              </w:rPr>
+              <w:t xml:space="preserve">3800</w:t>
+            </w:r>
+          </w:p>
+        </w:tc>
+      </w:tr>
+      <w:tr>
+        <w:tc>
+          <w:tcPr>
+            <w:tcW w:w="2400" w:type="dxa"/>
+            <w:tcMar>
+              <w:top w:w="60" w:type="dxa"/>
+              <w:left w:w="100" w:type="dxa"/>
+              <w:bottom w:w="60" w:type="dxa"/>
+              <w:right w:w="100" w:type="dxa"/>
+            </w:tcMar>
+          </w:tcPr>
+          <w:p>
+            <w:r>
+              <w:rPr>
+                <w:sz w:val="18"/>
+              </w:rPr>
+              <w:t xml:space="preserve">Bonus/Case 5/5.2.png</w:t>
+            </w:r>
+          </w:p>
+        </w:tc>
+        <w:tc>
+          <w:tcPr>
+            <w:tcW w:w="1400" w:type="dxa"/>
             <w:tcMar>
               <w:top w:w="60" w:type="dxa"/>
               <w:left w:w="100" w:type="dxa"/>
@@ -2460,7 +3349,7 @@
         </w:tc>
         <w:tc>
           <w:tcPr>
-            <w:tcW w:w="1100" w:type="dxa"/>
+            <w:tcW w:w="1700" w:type="dxa"/>
             <w:tcMar>
               <w:top w:w="60" w:type="dxa"/>
               <w:left w:w="100" w:type="dxa"/>
@@ -2476,13 +3365,37 @@
               <w:rPr>
                 <w:sz w:val="18"/>
               </w:rPr>
-              <w:t xml:space="preserve">2300</w:t>
+              <w:t xml:space="preserve">0</w:t>
             </w:r>
           </w:p>
         </w:tc>
         <w:tc>
           <w:tcPr>
-            <w:tcW w:w="1100" w:type="dxa"/>
+            <w:tcW w:w="1400" w:type="dxa"/>
+            <w:tcMar>
+              <w:top w:w="60" w:type="dxa"/>
+              <w:left w:w="100" w:type="dxa"/>
+              <w:bottom w:w="60" w:type="dxa"/>
+              <w:right w:w="100" w:type="dxa"/>
+            </w:tcMar>
+          </w:tcPr>
+          <w:p>
+            <w:pPr>
+              <w:jc w:val="center"/>
+            </w:pPr>
+            <w:r>
+              <w:rPr>
+                <w:b/>
+                <w:color w:val="2E7D32"/>
+                <w:sz w:val="18"/>
+              </w:rPr>
+              <w:t xml:space="preserve">PASS</w:t>
+            </w:r>
+          </w:p>
+        </w:tc>
+        <w:tc>
+          <w:tcPr>
+            <w:tcW w:w="3036" w:type="dxa"/>
             <w:tcMar>
               <w:top w:w="60" w:type="dxa"/>
               <w:left w:w="100" w:type="dxa"/>
@@ -2498,13 +3411,15 @@
               <w:rPr>
                 <w:sz w:val="18"/>
               </w:rPr>
-              <w:t xml:space="preserve">50</w:t>
+              <w:t xml:space="preserve">6400</w:t>
             </w:r>
           </w:p>
         </w:tc>
+      </w:tr>
+      <w:tr>
         <w:tc>
           <w:tcPr>
-            <w:tcW w:w="2236" w:type="dxa"/>
+            <w:tcW w:w="2400" w:type="dxa"/>
             <w:tcMar>
               <w:top w:w="60" w:type="dxa"/>
               <w:left w:w="100" w:type="dxa"/>
@@ -2517,34 +3432,13 @@
               <w:rPr>
                 <w:sz w:val="18"/>
               </w:rPr>
-              <w:t xml:space="preserve">TIE</w:t>
-            </w:r>
-          </w:p>
-        </w:tc>
-      </w:tr>
-      <w:tr>
-        <w:tc>
-          <w:tcPr>
-            <w:tcW w:w="2200" w:type="dxa"/>
-            <w:tcMar>
-              <w:top w:w="60" w:type="dxa"/>
-              <w:left w:w="100" w:type="dxa"/>
-              <w:bottom w:w="60" w:type="dxa"/>
-              <w:right w:w="100" w:type="dxa"/>
-            </w:tcMar>
-          </w:tcPr>
-          <w:p>
-            <w:r>
-              <w:rPr>
-                <w:sz w:val="18"/>
-              </w:rPr>
-              <w:t xml:space="preserve">Case 1/1.2.jpg</w:t>
+              <w:t xml:space="preserve">Bonus/Case 6/6.1.jpg</w:t>
             </w:r>
           </w:p>
         </w:tc>
         <w:tc>
           <w:tcPr>
-            <w:tcW w:w="1100" w:type="dxa"/>
+            <w:tcW w:w="1400" w:type="dxa"/>
             <w:tcMar>
               <w:top w:w="60" w:type="dxa"/>
               <w:left w:w="100" w:type="dxa"/>
@@ -2560,13 +3454,13 @@
               <w:rPr>
                 <w:sz w:val="18"/>
               </w:rPr>
-              <w:t xml:space="preserve">3000</w:t>
+              <w:t xml:space="preserve">5800</w:t>
             </w:r>
           </w:p>
         </w:tc>
         <w:tc>
           <w:tcPr>
-            <w:tcW w:w="1100" w:type="dxa"/>
+            <w:tcW w:w="1700" w:type="dxa"/>
             <w:tcMar>
               <w:top w:w="60" w:type="dxa"/>
               <w:left w:w="100" w:type="dxa"/>
@@ -2582,13 +3476,37 @@
               <w:rPr>
                 <w:sz w:val="18"/>
               </w:rPr>
-              <w:t xml:space="preserve">2950</w:t>
+              <w:t xml:space="preserve">6150</w:t>
             </w:r>
           </w:p>
         </w:tc>
         <w:tc>
           <w:tcPr>
-            <w:tcW w:w="1100" w:type="dxa"/>
+            <w:tcW w:w="1400" w:type="dxa"/>
+            <w:tcMar>
+              <w:top w:w="60" w:type="dxa"/>
+              <w:left w:w="100" w:type="dxa"/>
+              <w:bottom w:w="60" w:type="dxa"/>
+              <w:right w:w="100" w:type="dxa"/>
+            </w:tcMar>
+          </w:tcPr>
+          <w:p>
+            <w:pPr>
+              <w:jc w:val="center"/>
+            </w:pPr>
+            <w:r>
+              <w:rPr>
+                <w:b/>
+                <w:color w:val="2E7D32"/>
+                <w:sz w:val="18"/>
+              </w:rPr>
+              <w:t xml:space="preserve">PASS</w:t>
+            </w:r>
+          </w:p>
+        </w:tc>
+        <w:tc>
+          <w:tcPr>
+            <w:tcW w:w="3036" w:type="dxa"/>
             <w:tcMar>
               <w:top w:w="60" w:type="dxa"/>
               <w:left w:w="100" w:type="dxa"/>
@@ -2604,13 +3522,34 @@
               <w:rPr>
                 <w:sz w:val="18"/>
               </w:rPr>
-              <w:t xml:space="preserve">50</w:t>
+              <w:t xml:space="preserve">5100</w:t>
+            </w:r>
+          </w:p>
+        </w:tc>
+      </w:tr>
+      <w:tr>
+        <w:tc>
+          <w:tcPr>
+            <w:tcW w:w="2400" w:type="dxa"/>
+            <w:tcMar>
+              <w:top w:w="60" w:type="dxa"/>
+              <w:left w:w="100" w:type="dxa"/>
+              <w:bottom w:w="60" w:type="dxa"/>
+              <w:right w:w="100" w:type="dxa"/>
+            </w:tcMar>
+          </w:tcPr>
+          <w:p>
+            <w:r>
+              <w:rPr>
+                <w:sz w:val="18"/>
+              </w:rPr>
+              <w:t xml:space="preserve">Bonus/Case 6/6.2.jpg</w:t>
             </w:r>
           </w:p>
         </w:tc>
         <w:tc>
           <w:tcPr>
-            <w:tcW w:w="1100" w:type="dxa"/>
+            <w:tcW w:w="1400" w:type="dxa"/>
             <w:tcMar>
               <w:top w:w="60" w:type="dxa"/>
               <w:left w:w="100" w:type="dxa"/>
@@ -2626,13 +3565,13 @@
               <w:rPr>
                 <w:sz w:val="18"/>
               </w:rPr>
-              <w:t xml:space="preserve">2500</w:t>
+              <w:t xml:space="preserve">6450</w:t>
             </w:r>
           </w:p>
         </w:tc>
         <w:tc>
           <w:tcPr>
-            <w:tcW w:w="1100" w:type="dxa"/>
+            <w:tcW w:w="1700" w:type="dxa"/>
             <w:tcMar>
               <w:top w:w="60" w:type="dxa"/>
               <w:left w:w="100" w:type="dxa"/>
@@ -2648,13 +3587,13 @@
               <w:rPr>
                 <w:sz w:val="18"/>
               </w:rPr>
-              <w:t xml:space="preserve">500</w:t>
+              <w:t xml:space="preserve">4250</w:t>
             </w:r>
           </w:p>
         </w:tc>
         <w:tc>
           <w:tcPr>
-            <w:tcW w:w="2236" w:type="dxa"/>
+            <w:tcW w:w="1400" w:type="dxa"/>
             <w:tcMar>
               <w:top w:w="60" w:type="dxa"/>
               <w:left w:w="100" w:type="dxa"/>
@@ -2663,38 +3602,22 @@
             </w:tcMar>
           </w:tcPr>
           <w:p>
+            <w:pPr>
+              <w:jc w:val="center"/>
+            </w:pPr>
             <w:r>
               <w:rPr>
+                <w:b/>
+                <w:color w:val="2E7D32"/>
                 <w:sz w:val="18"/>
               </w:rPr>
-              <w:t xml:space="preserve">HC</w:t>
-            </w:r>
-          </w:p>
-        </w:tc>
-      </w:tr>
-      <w:tr>
-        <w:tc>
-          <w:tcPr>
-            <w:tcW w:w="2200" w:type="dxa"/>
-            <w:tcMar>
-              <w:top w:w="60" w:type="dxa"/>
-              <w:left w:w="100" w:type="dxa"/>
-              <w:bottom w:w="60" w:type="dxa"/>
-              <w:right w:w="100" w:type="dxa"/>
-            </w:tcMar>
-          </w:tcPr>
-          <w:p>
-            <w:r>
-              <w:rPr>
-                <w:sz w:val="18"/>
-              </w:rPr>
-              <w:t xml:space="preserve">Case 2/2.1.jpg</w:t>
+              <w:t xml:space="preserve">PASS</w:t>
             </w:r>
           </w:p>
         </w:tc>
         <w:tc>
           <w:tcPr>
-            <w:tcW w:w="1100" w:type="dxa"/>
+            <w:tcW w:w="3036" w:type="dxa"/>
             <w:tcMar>
               <w:top w:w="60" w:type="dxa"/>
               <w:left w:w="100" w:type="dxa"/>
@@ -2710,13 +3633,34 @@
               <w:rPr>
                 <w:sz w:val="18"/>
               </w:rPr>
-              <w:t xml:space="preserve">3050</w:t>
+              <w:t xml:space="preserve">1900</w:t>
+            </w:r>
+          </w:p>
+        </w:tc>
+      </w:tr>
+      <w:tr>
+        <w:tc>
+          <w:tcPr>
+            <w:tcW w:w="2400" w:type="dxa"/>
+            <w:tcMar>
+              <w:top w:w="60" w:type="dxa"/>
+              <w:left w:w="100" w:type="dxa"/>
+              <w:bottom w:w="60" w:type="dxa"/>
+              <w:right w:w="100" w:type="dxa"/>
+            </w:tcMar>
+          </w:tcPr>
+          <w:p>
+            <w:r>
+              <w:rPr>
+                <w:sz w:val="18"/>
+              </w:rPr>
+              <w:t xml:space="preserve">Bonus/Case 6/6.3.jpg</w:t>
             </w:r>
           </w:p>
         </w:tc>
         <w:tc>
           <w:tcPr>
-            <w:tcW w:w="1100" w:type="dxa"/>
+            <w:tcW w:w="1400" w:type="dxa"/>
             <w:tcMar>
               <w:top w:w="60" w:type="dxa"/>
               <w:left w:w="100" w:type="dxa"/>
@@ -2732,13 +3676,13 @@
               <w:rPr>
                 <w:sz w:val="18"/>
               </w:rPr>
-              <w:t xml:space="preserve">1050</w:t>
+              <w:t xml:space="preserve">5550</w:t>
             </w:r>
           </w:p>
         </w:tc>
         <w:tc>
           <w:tcPr>
-            <w:tcW w:w="1100" w:type="dxa"/>
+            <w:tcW w:w="1700" w:type="dxa"/>
             <w:tcMar>
               <w:top w:w="60" w:type="dxa"/>
               <w:left w:w="100" w:type="dxa"/>
@@ -2754,13 +3698,37 @@
               <w:rPr>
                 <w:sz w:val="18"/>
               </w:rPr>
-              <w:t xml:space="preserve">2000</w:t>
+              <w:t xml:space="preserve">2650</w:t>
             </w:r>
           </w:p>
         </w:tc>
         <w:tc>
           <w:tcPr>
-            <w:tcW w:w="1100" w:type="dxa"/>
+            <w:tcW w:w="1400" w:type="dxa"/>
+            <w:tcMar>
+              <w:top w:w="60" w:type="dxa"/>
+              <w:left w:w="100" w:type="dxa"/>
+              <w:bottom w:w="60" w:type="dxa"/>
+              <w:right w:w="100" w:type="dxa"/>
+            </w:tcMar>
+          </w:tcPr>
+          <w:p>
+            <w:pPr>
+              <w:jc w:val="center"/>
+            </w:pPr>
+            <w:r>
+              <w:rPr>
+                <w:b/>
+                <w:color w:val="2E7D32"/>
+                <w:sz w:val="18"/>
+              </w:rPr>
+              <w:t xml:space="preserve">PASS</w:t>
+            </w:r>
+          </w:p>
+        </w:tc>
+        <w:tc>
+          <w:tcPr>
+            <w:tcW w:w="3036" w:type="dxa"/>
             <w:tcMar>
               <w:top w:w="60" w:type="dxa"/>
               <w:left w:w="100" w:type="dxa"/>
@@ -2776,13 +3744,34 @@
               <w:rPr>
                 <w:sz w:val="18"/>
               </w:rPr>
-              <w:t xml:space="preserve">2050</w:t>
+              <w:t xml:space="preserve">2100</w:t>
+            </w:r>
+          </w:p>
+        </w:tc>
+      </w:tr>
+      <w:tr>
+        <w:tc>
+          <w:tcPr>
+            <w:tcW w:w="2400" w:type="dxa"/>
+            <w:tcMar>
+              <w:top w:w="60" w:type="dxa"/>
+              <w:left w:w="100" w:type="dxa"/>
+              <w:bottom w:w="60" w:type="dxa"/>
+              <w:right w:w="100" w:type="dxa"/>
+            </w:tcMar>
+          </w:tcPr>
+          <w:p>
+            <w:r>
+              <w:rPr>
+                <w:sz w:val="18"/>
+              </w:rPr>
+              <w:t xml:space="preserve">Bonus/Case 7/7.1.jpg</w:t>
             </w:r>
           </w:p>
         </w:tc>
         <w:tc>
           <w:tcPr>
-            <w:tcW w:w="1100" w:type="dxa"/>
+            <w:tcW w:w="1400" w:type="dxa"/>
             <w:tcMar>
               <w:top w:w="60" w:type="dxa"/>
               <w:left w:w="100" w:type="dxa"/>
@@ -2798,53 +3787,13 @@
               <w:rPr>
                 <w:sz w:val="18"/>
               </w:rPr>
-              <w:t xml:space="preserve">1000</w:t>
+              <w:t xml:space="preserve">8650</w:t>
             </w:r>
           </w:p>
         </w:tc>
         <w:tc>
           <w:tcPr>
-            <w:tcW w:w="2236" w:type="dxa"/>
-            <w:tcMar>
-              <w:top w:w="60" w:type="dxa"/>
-              <w:left w:w="100" w:type="dxa"/>
-              <w:bottom w:w="60" w:type="dxa"/>
-              <w:right w:w="100" w:type="dxa"/>
-            </w:tcMar>
-          </w:tcPr>
-          <w:p>
-            <w:r>
-              <w:rPr>
-                <w:sz w:val="18"/>
-              </w:rPr>
-              <w:t xml:space="preserve">DD</w:t>
-            </w:r>
-          </w:p>
-        </w:tc>
-      </w:tr>
-      <w:tr>
-        <w:tc>
-          <w:tcPr>
-            <w:tcW w:w="2200" w:type="dxa"/>
-            <w:tcMar>
-              <w:top w:w="60" w:type="dxa"/>
-              <w:left w:w="100" w:type="dxa"/>
-              <w:bottom w:w="60" w:type="dxa"/>
-              <w:right w:w="100" w:type="dxa"/>
-            </w:tcMar>
-          </w:tcPr>
-          <w:p>
-            <w:r>
-              <w:rPr>
-                <w:sz w:val="18"/>
-              </w:rPr>
-              <w:t xml:space="preserve">Case 2/4.2.jpg</w:t>
-            </w:r>
-          </w:p>
-        </w:tc>
-        <w:tc>
-          <w:tcPr>
-            <w:tcW w:w="1100" w:type="dxa"/>
+            <w:tcW w:w="1700" w:type="dxa"/>
             <w:tcMar>
               <w:top w:w="60" w:type="dxa"/>
               <w:left w:w="100" w:type="dxa"/>
@@ -2860,13 +3809,37 @@
               <w:rPr>
                 <w:sz w:val="18"/>
               </w:rPr>
-              <w:t xml:space="preserve">3400</w:t>
+              <w:t xml:space="preserve">3750</w:t>
             </w:r>
           </w:p>
         </w:tc>
         <w:tc>
           <w:tcPr>
-            <w:tcW w:w="1100" w:type="dxa"/>
+            <w:tcW w:w="1400" w:type="dxa"/>
+            <w:tcMar>
+              <w:top w:w="60" w:type="dxa"/>
+              <w:left w:w="100" w:type="dxa"/>
+              <w:bottom w:w="60" w:type="dxa"/>
+              <w:right w:w="100" w:type="dxa"/>
+            </w:tcMar>
+          </w:tcPr>
+          <w:p>
+            <w:pPr>
+              <w:jc w:val="center"/>
+            </w:pPr>
+            <w:r>
+              <w:rPr>
+                <w:b/>
+                <w:color w:val="2E7D32"/>
+                <w:sz w:val="18"/>
+              </w:rPr>
+              <w:t xml:space="preserve">PASS</w:t>
+            </w:r>
+          </w:p>
+        </w:tc>
+        <w:tc>
+          <w:tcPr>
+            <w:tcW w:w="3036" w:type="dxa"/>
             <w:tcMar>
               <w:top w:w="60" w:type="dxa"/>
               <w:left w:w="100" w:type="dxa"/>
@@ -2882,13 +3855,34 @@
               <w:rPr>
                 <w:sz w:val="18"/>
               </w:rPr>
-              <w:t xml:space="preserve">2150</w:t>
+              <w:t xml:space="preserve">8300</w:t>
+            </w:r>
+          </w:p>
+        </w:tc>
+      </w:tr>
+      <w:tr>
+        <w:tc>
+          <w:tcPr>
+            <w:tcW w:w="2400" w:type="dxa"/>
+            <w:tcMar>
+              <w:top w:w="60" w:type="dxa"/>
+              <w:left w:w="100" w:type="dxa"/>
+              <w:bottom w:w="60" w:type="dxa"/>
+              <w:right w:w="100" w:type="dxa"/>
+            </w:tcMar>
+          </w:tcPr>
+          <w:p>
+            <w:r>
+              <w:rPr>
+                <w:sz w:val="18"/>
+              </w:rPr>
+              <w:t xml:space="preserve">Bonus/Case 7/7.2.jpg</w:t>
             </w:r>
           </w:p>
         </w:tc>
         <w:tc>
           <w:tcPr>
-            <w:tcW w:w="1100" w:type="dxa"/>
+            <w:tcW w:w="1400" w:type="dxa"/>
             <w:tcMar>
               <w:top w:w="60" w:type="dxa"/>
               <w:left w:w="100" w:type="dxa"/>
@@ -2904,13 +3898,13 @@
               <w:rPr>
                 <w:sz w:val="18"/>
               </w:rPr>
-              <w:t xml:space="preserve">1250</w:t>
+              <w:t xml:space="preserve">6550</w:t>
             </w:r>
           </w:p>
         </w:tc>
         <w:tc>
           <w:tcPr>
-            <w:tcW w:w="1100" w:type="dxa"/>
+            <w:tcW w:w="1700" w:type="dxa"/>
             <w:tcMar>
               <w:top w:w="60" w:type="dxa"/>
               <w:left w:w="100" w:type="dxa"/>
@@ -2926,13 +3920,37 @@
               <w:rPr>
                 <w:sz w:val="18"/>
               </w:rPr>
-              <w:t xml:space="preserve">1600</w:t>
+              <w:t xml:space="preserve">3850</w:t>
             </w:r>
           </w:p>
         </w:tc>
         <w:tc>
           <w:tcPr>
-            <w:tcW w:w="1100" w:type="dxa"/>
+            <w:tcW w:w="1400" w:type="dxa"/>
+            <w:tcMar>
+              <w:top w:w="60" w:type="dxa"/>
+              <w:left w:w="100" w:type="dxa"/>
+              <w:bottom w:w="60" w:type="dxa"/>
+              <w:right w:w="100" w:type="dxa"/>
+            </w:tcMar>
+          </w:tcPr>
+          <w:p>
+            <w:pPr>
+              <w:jc w:val="center"/>
+            </w:pPr>
+            <w:r>
+              <w:rPr>
+                <w:b/>
+                <w:color w:val="2E7D32"/>
+                <w:sz w:val="18"/>
+              </w:rPr>
+              <w:t xml:space="preserve">PASS</w:t>
+            </w:r>
+          </w:p>
+        </w:tc>
+        <w:tc>
+          <w:tcPr>
+            <w:tcW w:w="3036" w:type="dxa"/>
             <w:tcMar>
               <w:top w:w="60" w:type="dxa"/>
               <w:left w:w="100" w:type="dxa"/>
@@ -2948,13 +3966,15 @@
               <w:rPr>
                 <w:sz w:val="18"/>
               </w:rPr>
-              <w:t xml:space="preserve">1800</w:t>
+              <w:t xml:space="preserve">0</w:t>
             </w:r>
           </w:p>
         </w:tc>
+      </w:tr>
+      <w:tr>
         <w:tc>
           <w:tcPr>
-            <w:tcW w:w="2236" w:type="dxa"/>
+            <w:tcW w:w="2400" w:type="dxa"/>
             <w:tcMar>
               <w:top w:w="60" w:type="dxa"/>
               <w:left w:w="100" w:type="dxa"/>
@@ -2967,34 +3987,13 @@
               <w:rPr>
                 <w:sz w:val="18"/>
               </w:rPr>
-              <w:t xml:space="preserve">HC</w:t>
-            </w:r>
-          </w:p>
-        </w:tc>
-      </w:tr>
-      <w:tr>
-        <w:tc>
-          <w:tcPr>
-            <w:tcW w:w="2200" w:type="dxa"/>
-            <w:tcMar>
-              <w:top w:w="60" w:type="dxa"/>
-              <w:left w:w="100" w:type="dxa"/>
-              <w:bottom w:w="60" w:type="dxa"/>
-              <w:right w:w="100" w:type="dxa"/>
-            </w:tcMar>
-          </w:tcPr>
-          <w:p>
-            <w:r>
-              <w:rPr>
-                <w:sz w:val="18"/>
-              </w:rPr>
-              <w:t xml:space="preserve">Case 3/3.1.jpg</w:t>
+              <w:t xml:space="preserve">Bonus/Case 8/8.1.jpg</w:t>
             </w:r>
           </w:p>
         </w:tc>
         <w:tc>
           <w:tcPr>
-            <w:tcW w:w="1100" w:type="dxa"/>
+            <w:tcW w:w="1400" w:type="dxa"/>
             <w:tcMar>
               <w:top w:w="60" w:type="dxa"/>
               <w:left w:w="100" w:type="dxa"/>
@@ -3010,13 +4009,13 @@
               <w:rPr>
                 <w:sz w:val="18"/>
               </w:rPr>
-              <w:t xml:space="preserve">2800</w:t>
+              <w:t xml:space="preserve">4300</w:t>
             </w:r>
           </w:p>
         </w:tc>
         <w:tc>
           <w:tcPr>
-            <w:tcW w:w="1100" w:type="dxa"/>
+            <w:tcW w:w="1700" w:type="dxa"/>
             <w:tcMar>
               <w:top w:w="60" w:type="dxa"/>
               <w:left w:w="100" w:type="dxa"/>
@@ -3032,13 +4031,37 @@
               <w:rPr>
                 <w:sz w:val="18"/>
               </w:rPr>
-              <w:t xml:space="preserve">1400</w:t>
+              <w:t xml:space="preserve">9600</w:t>
             </w:r>
           </w:p>
         </w:tc>
         <w:tc>
           <w:tcPr>
-            <w:tcW w:w="1100" w:type="dxa"/>
+            <w:tcW w:w="1400" w:type="dxa"/>
+            <w:tcMar>
+              <w:top w:w="60" w:type="dxa"/>
+              <w:left w:w="100" w:type="dxa"/>
+              <w:bottom w:w="60" w:type="dxa"/>
+              <w:right w:w="100" w:type="dxa"/>
+            </w:tcMar>
+          </w:tcPr>
+          <w:p>
+            <w:pPr>
+              <w:jc w:val="center"/>
+            </w:pPr>
+            <w:r>
+              <w:rPr>
+                <w:b/>
+                <w:color w:val="2E7D32"/>
+                <w:sz w:val="18"/>
+              </w:rPr>
+              <w:t xml:space="preserve">PASS</w:t>
+            </w:r>
+          </w:p>
+        </w:tc>
+        <w:tc>
+          <w:tcPr>
+            <w:tcW w:w="3036" w:type="dxa"/>
             <w:tcMar>
               <w:top w:w="60" w:type="dxa"/>
               <w:left w:w="100" w:type="dxa"/>
@@ -3054,13 +4077,34 @@
               <w:rPr>
                 <w:sz w:val="18"/>
               </w:rPr>
-              <w:t xml:space="preserve">1400</w:t>
+              <w:t xml:space="preserve">350</w:t>
+            </w:r>
+          </w:p>
+        </w:tc>
+      </w:tr>
+      <w:tr>
+        <w:tc>
+          <w:tcPr>
+            <w:tcW w:w="2400" w:type="dxa"/>
+            <w:tcMar>
+              <w:top w:w="60" w:type="dxa"/>
+              <w:left w:w="100" w:type="dxa"/>
+              <w:bottom w:w="60" w:type="dxa"/>
+              <w:right w:w="100" w:type="dxa"/>
+            </w:tcMar>
+          </w:tcPr>
+          <w:p>
+            <w:r>
+              <w:rPr>
+                <w:sz w:val="18"/>
+              </w:rPr>
+              <w:t xml:space="preserve">Bonus/Case 8/8.2.jpg</w:t>
             </w:r>
           </w:p>
         </w:tc>
         <w:tc>
           <w:tcPr>
-            <w:tcW w:w="1100" w:type="dxa"/>
+            <w:tcW w:w="1400" w:type="dxa"/>
             <w:tcMar>
               <w:top w:w="60" w:type="dxa"/>
               <w:left w:w="100" w:type="dxa"/>
@@ -3076,569 +4120,13 @@
               <w:rPr>
                 <w:sz w:val="18"/>
               </w:rPr>
-              <w:t xml:space="preserve">2700</w:t>
+              <w:t xml:space="preserve">3900</w:t>
             </w:r>
           </w:p>
         </w:tc>
         <w:tc>
           <w:tcPr>
-            <w:tcW w:w="1100" w:type="dxa"/>
-            <w:tcMar>
-              <w:top w:w="60" w:type="dxa"/>
-              <w:left w:w="100" w:type="dxa"/>
-              <w:bottom w:w="60" w:type="dxa"/>
-              <w:right w:w="100" w:type="dxa"/>
-            </w:tcMar>
-          </w:tcPr>
-          <w:p>
-            <w:pPr>
-              <w:jc w:val="right"/>
-            </w:pPr>
-            <w:r>
-              <w:rPr>
-                <w:sz w:val="18"/>
-              </w:rPr>
-              <w:t xml:space="preserve">100</w:t>
-            </w:r>
-          </w:p>
-        </w:tc>
-        <w:tc>
-          <w:tcPr>
-            <w:tcW w:w="2236" w:type="dxa"/>
-            <w:tcMar>
-              <w:top w:w="60" w:type="dxa"/>
-              <w:left w:w="100" w:type="dxa"/>
-              <w:bottom w:w="60" w:type="dxa"/>
-              <w:right w:w="100" w:type="dxa"/>
-            </w:tcMar>
-          </w:tcPr>
-          <w:p>
-            <w:r>
-              <w:rPr>
-                <w:sz w:val="18"/>
-              </w:rPr>
-              <w:t xml:space="preserve">DD</w:t>
-            </w:r>
-          </w:p>
-        </w:tc>
-      </w:tr>
-      <w:tr>
-        <w:tc>
-          <w:tcPr>
-            <w:tcW w:w="2200" w:type="dxa"/>
-            <w:tcMar>
-              <w:top w:w="60" w:type="dxa"/>
-              <w:left w:w="100" w:type="dxa"/>
-              <w:bottom w:w="60" w:type="dxa"/>
-              <w:right w:w="100" w:type="dxa"/>
-            </w:tcMar>
-          </w:tcPr>
-          <w:p>
-            <w:r>
-              <w:rPr>
-                <w:sz w:val="18"/>
-              </w:rPr>
-              <w:t xml:space="preserve">Case 3/3.2.png</w:t>
-            </w:r>
-          </w:p>
-        </w:tc>
-        <w:tc>
-          <w:tcPr>
-            <w:tcW w:w="1100" w:type="dxa"/>
-            <w:tcMar>
-              <w:top w:w="60" w:type="dxa"/>
-              <w:left w:w="100" w:type="dxa"/>
-              <w:bottom w:w="60" w:type="dxa"/>
-              <w:right w:w="100" w:type="dxa"/>
-            </w:tcMar>
-          </w:tcPr>
-          <w:p>
-            <w:pPr>
-              <w:jc w:val="right"/>
-            </w:pPr>
-            <w:r>
-              <w:rPr>
-                <w:sz w:val="18"/>
-              </w:rPr>
-              <w:t xml:space="preserve">5150</w:t>
-            </w:r>
-          </w:p>
-        </w:tc>
-        <w:tc>
-          <w:tcPr>
-            <w:tcW w:w="1100" w:type="dxa"/>
-            <w:tcMar>
-              <w:top w:w="60" w:type="dxa"/>
-              <w:left w:w="100" w:type="dxa"/>
-              <w:bottom w:w="60" w:type="dxa"/>
-              <w:right w:w="100" w:type="dxa"/>
-            </w:tcMar>
-          </w:tcPr>
-          <w:p>
-            <w:pPr>
-              <w:jc w:val="right"/>
-            </w:pPr>
-            <w:r>
-              <w:rPr>
-                <w:sz w:val="18"/>
-              </w:rPr>
-              <w:t xml:space="preserve">3800</w:t>
-            </w:r>
-          </w:p>
-        </w:tc>
-        <w:tc>
-          <w:tcPr>
-            <w:tcW w:w="1100" w:type="dxa"/>
-            <w:tcMar>
-              <w:top w:w="60" w:type="dxa"/>
-              <w:left w:w="100" w:type="dxa"/>
-              <w:bottom w:w="60" w:type="dxa"/>
-              <w:right w:w="100" w:type="dxa"/>
-            </w:tcMar>
-          </w:tcPr>
-          <w:p>
-            <w:pPr>
-              <w:jc w:val="right"/>
-            </w:pPr>
-            <w:r>
-              <w:rPr>
-                <w:sz w:val="18"/>
-              </w:rPr>
-              <w:t xml:space="preserve">1350</w:t>
-            </w:r>
-          </w:p>
-        </w:tc>
-        <w:tc>
-          <w:tcPr>
-            <w:tcW w:w="1100" w:type="dxa"/>
-            <w:tcMar>
-              <w:top w:w="60" w:type="dxa"/>
-              <w:left w:w="100" w:type="dxa"/>
-              <w:bottom w:w="60" w:type="dxa"/>
-              <w:right w:w="100" w:type="dxa"/>
-            </w:tcMar>
-          </w:tcPr>
-          <w:p>
-            <w:pPr>
-              <w:jc w:val="right"/>
-            </w:pPr>
-            <w:r>
-              <w:rPr>
-                <w:sz w:val="18"/>
-              </w:rPr>
-              <w:t xml:space="preserve">2200</w:t>
-            </w:r>
-          </w:p>
-        </w:tc>
-        <w:tc>
-          <w:tcPr>
-            <w:tcW w:w="1100" w:type="dxa"/>
-            <w:tcMar>
-              <w:top w:w="60" w:type="dxa"/>
-              <w:left w:w="100" w:type="dxa"/>
-              <w:bottom w:w="60" w:type="dxa"/>
-              <w:right w:w="100" w:type="dxa"/>
-            </w:tcMar>
-          </w:tcPr>
-          <w:p>
-            <w:pPr>
-              <w:jc w:val="right"/>
-            </w:pPr>
-            <w:r>
-              <w:rPr>
-                <w:sz w:val="18"/>
-              </w:rPr>
-              <w:t xml:space="preserve">2950</w:t>
-            </w:r>
-          </w:p>
-        </w:tc>
-        <w:tc>
-          <w:tcPr>
-            <w:tcW w:w="2236" w:type="dxa"/>
-            <w:tcMar>
-              <w:top w:w="60" w:type="dxa"/>
-              <w:left w:w="100" w:type="dxa"/>
-              <w:bottom w:w="60" w:type="dxa"/>
-              <w:right w:w="100" w:type="dxa"/>
-            </w:tcMar>
-          </w:tcPr>
-          <w:p>
-            <w:r>
-              <w:rPr>
-                <w:sz w:val="18"/>
-              </w:rPr>
-              <w:t xml:space="preserve">HC</w:t>
-            </w:r>
-          </w:p>
-        </w:tc>
-      </w:tr>
-      <w:tr>
-        <w:tc>
-          <w:tcPr>
-            <w:tcW w:w="2200" w:type="dxa"/>
-            <w:tcMar>
-              <w:top w:w="60" w:type="dxa"/>
-              <w:left w:w="100" w:type="dxa"/>
-              <w:bottom w:w="60" w:type="dxa"/>
-              <w:right w:w="100" w:type="dxa"/>
-            </w:tcMar>
-          </w:tcPr>
-          <w:p>
-            <w:r>
-              <w:rPr>
-                <w:sz w:val="18"/>
-              </w:rPr>
-              <w:t xml:space="preserve">Case 4/4.1.jpg</w:t>
-            </w:r>
-          </w:p>
-        </w:tc>
-        <w:tc>
-          <w:tcPr>
-            <w:tcW w:w="1100" w:type="dxa"/>
-            <w:tcMar>
-              <w:top w:w="60" w:type="dxa"/>
-              <w:left w:w="100" w:type="dxa"/>
-              <w:bottom w:w="60" w:type="dxa"/>
-              <w:right w:w="100" w:type="dxa"/>
-            </w:tcMar>
-          </w:tcPr>
-          <w:p>
-            <w:pPr>
-              <w:jc w:val="right"/>
-            </w:pPr>
-            <w:r>
-              <w:rPr>
-                <w:sz w:val="18"/>
-              </w:rPr>
-              <w:t xml:space="preserve">5900</w:t>
-            </w:r>
-          </w:p>
-        </w:tc>
-        <w:tc>
-          <w:tcPr>
-            <w:tcW w:w="1100" w:type="dxa"/>
-            <w:tcMar>
-              <w:top w:w="60" w:type="dxa"/>
-              <w:left w:w="100" w:type="dxa"/>
-              <w:bottom w:w="60" w:type="dxa"/>
-              <w:right w:w="100" w:type="dxa"/>
-            </w:tcMar>
-          </w:tcPr>
-          <w:p>
-            <w:pPr>
-              <w:jc w:val="right"/>
-            </w:pPr>
-            <w:r>
-              <w:rPr>
-                <w:sz w:val="18"/>
-              </w:rPr>
-              <w:t xml:space="preserve">6100</w:t>
-            </w:r>
-          </w:p>
-        </w:tc>
-        <w:tc>
-          <w:tcPr>
-            <w:tcW w:w="1100" w:type="dxa"/>
-            <w:tcMar>
-              <w:top w:w="60" w:type="dxa"/>
-              <w:left w:w="100" w:type="dxa"/>
-              <w:bottom w:w="60" w:type="dxa"/>
-              <w:right w:w="100" w:type="dxa"/>
-            </w:tcMar>
-          </w:tcPr>
-          <w:p>
-            <w:pPr>
-              <w:jc w:val="right"/>
-            </w:pPr>
-            <w:r>
-              <w:rPr>
-                <w:sz w:val="18"/>
-              </w:rPr>
-              <w:t xml:space="preserve">200</w:t>
-            </w:r>
-          </w:p>
-        </w:tc>
-        <w:tc>
-          <w:tcPr>
-            <w:tcW w:w="1100" w:type="dxa"/>
-            <w:tcMar>
-              <w:top w:w="60" w:type="dxa"/>
-              <w:left w:w="100" w:type="dxa"/>
-              <w:bottom w:w="60" w:type="dxa"/>
-              <w:right w:w="100" w:type="dxa"/>
-            </w:tcMar>
-          </w:tcPr>
-          <w:p>
-            <w:pPr>
-              <w:jc w:val="right"/>
-            </w:pPr>
-            <w:r>
-              <w:rPr>
-                <w:sz w:val="18"/>
-              </w:rPr>
-              <w:t xml:space="preserve">7850</w:t>
-            </w:r>
-          </w:p>
-        </w:tc>
-        <w:tc>
-          <w:tcPr>
-            <w:tcW w:w="1100" w:type="dxa"/>
-            <w:tcMar>
-              <w:top w:w="60" w:type="dxa"/>
-              <w:left w:w="100" w:type="dxa"/>
-              <w:bottom w:w="60" w:type="dxa"/>
-              <w:right w:w="100" w:type="dxa"/>
-            </w:tcMar>
-          </w:tcPr>
-          <w:p>
-            <w:pPr>
-              <w:jc w:val="right"/>
-            </w:pPr>
-            <w:r>
-              <w:rPr>
-                <w:sz w:val="18"/>
-              </w:rPr>
-              <w:t xml:space="preserve">1950</w:t>
-            </w:r>
-          </w:p>
-        </w:tc>
-        <w:tc>
-          <w:tcPr>
-            <w:tcW w:w="2236" w:type="dxa"/>
-            <w:tcMar>
-              <w:top w:w="60" w:type="dxa"/>
-              <w:left w:w="100" w:type="dxa"/>
-              <w:bottom w:w="60" w:type="dxa"/>
-              <w:right w:w="100" w:type="dxa"/>
-            </w:tcMar>
-          </w:tcPr>
-          <w:p>
-            <w:r>
-              <w:rPr>
-                <w:sz w:val="18"/>
-              </w:rPr>
-              <w:t xml:space="preserve">HC</w:t>
-            </w:r>
-          </w:p>
-        </w:tc>
-      </w:tr>
-      <w:tr>
-        <w:tc>
-          <w:tcPr>
-            <w:tcW w:w="2200" w:type="dxa"/>
-            <w:tcMar>
-              <w:top w:w="60" w:type="dxa"/>
-              <w:left w:w="100" w:type="dxa"/>
-              <w:bottom w:w="60" w:type="dxa"/>
-              <w:right w:w="100" w:type="dxa"/>
-            </w:tcMar>
-          </w:tcPr>
-          <w:p>
-            <w:r>
-              <w:rPr>
-                <w:sz w:val="18"/>
-              </w:rPr>
-              <w:t xml:space="preserve">Case 4/4.2.jpg</w:t>
-            </w:r>
-          </w:p>
-        </w:tc>
-        <w:tc>
-          <w:tcPr>
-            <w:tcW w:w="1100" w:type="dxa"/>
-            <w:tcMar>
-              <w:top w:w="60" w:type="dxa"/>
-              <w:left w:w="100" w:type="dxa"/>
-              <w:bottom w:w="60" w:type="dxa"/>
-              <w:right w:w="100" w:type="dxa"/>
-            </w:tcMar>
-          </w:tcPr>
-          <w:p>
-            <w:pPr>
-              <w:jc w:val="right"/>
-            </w:pPr>
-            <w:r>
-              <w:rPr>
-                <w:sz w:val="18"/>
-              </w:rPr>
-              <w:t xml:space="preserve">12150</w:t>
-            </w:r>
-          </w:p>
-        </w:tc>
-        <w:tc>
-          <w:tcPr>
-            <w:tcW w:w="1100" w:type="dxa"/>
-            <w:tcMar>
-              <w:top w:w="60" w:type="dxa"/>
-              <w:left w:w="100" w:type="dxa"/>
-              <w:bottom w:w="60" w:type="dxa"/>
-              <w:right w:w="100" w:type="dxa"/>
-            </w:tcMar>
-          </w:tcPr>
-          <w:p>
-            <w:pPr>
-              <w:jc w:val="right"/>
-            </w:pPr>
-            <w:r>
-              <w:rPr>
-                <w:sz w:val="18"/>
-              </w:rPr>
-              <w:t xml:space="preserve">11950</w:t>
-            </w:r>
-          </w:p>
-        </w:tc>
-        <w:tc>
-          <w:tcPr>
-            <w:tcW w:w="1100" w:type="dxa"/>
-            <w:tcMar>
-              <w:top w:w="60" w:type="dxa"/>
-              <w:left w:w="100" w:type="dxa"/>
-              <w:bottom w:w="60" w:type="dxa"/>
-              <w:right w:w="100" w:type="dxa"/>
-            </w:tcMar>
-          </w:tcPr>
-          <w:p>
-            <w:pPr>
-              <w:jc w:val="right"/>
-            </w:pPr>
-            <w:r>
-              <w:rPr>
-                <w:sz w:val="18"/>
-              </w:rPr>
-              <w:t xml:space="preserve">200</w:t>
-            </w:r>
-          </w:p>
-        </w:tc>
-        <w:tc>
-          <w:tcPr>
-            <w:tcW w:w="1100" w:type="dxa"/>
-            <w:tcMar>
-              <w:top w:w="60" w:type="dxa"/>
-              <w:left w:w="100" w:type="dxa"/>
-              <w:bottom w:w="60" w:type="dxa"/>
-              <w:right w:w="100" w:type="dxa"/>
-            </w:tcMar>
-          </w:tcPr>
-          <w:p>
-            <w:pPr>
-              <w:jc w:val="right"/>
-            </w:pPr>
-            <w:r>
-              <w:rPr>
-                <w:sz w:val="18"/>
-              </w:rPr>
-              <w:t xml:space="preserve">9750</w:t>
-            </w:r>
-          </w:p>
-        </w:tc>
-        <w:tc>
-          <w:tcPr>
-            <w:tcW w:w="1100" w:type="dxa"/>
-            <w:tcMar>
-              <w:top w:w="60" w:type="dxa"/>
-              <w:left w:w="100" w:type="dxa"/>
-              <w:bottom w:w="60" w:type="dxa"/>
-              <w:right w:w="100" w:type="dxa"/>
-            </w:tcMar>
-          </w:tcPr>
-          <w:p>
-            <w:pPr>
-              <w:jc w:val="right"/>
-            </w:pPr>
-            <w:r>
-              <w:rPr>
-                <w:sz w:val="18"/>
-              </w:rPr>
-              <w:t xml:space="preserve">2400</w:t>
-            </w:r>
-          </w:p>
-        </w:tc>
-        <w:tc>
-          <w:tcPr>
-            <w:tcW w:w="2236" w:type="dxa"/>
-            <w:tcMar>
-              <w:top w:w="60" w:type="dxa"/>
-              <w:left w:w="100" w:type="dxa"/>
-              <w:bottom w:w="60" w:type="dxa"/>
-              <w:right w:w="100" w:type="dxa"/>
-            </w:tcMar>
-          </w:tcPr>
-          <w:p>
-            <w:r>
-              <w:rPr>
-                <w:sz w:val="18"/>
-              </w:rPr>
-              <w:t xml:space="preserve">HC</w:t>
-            </w:r>
-          </w:p>
-        </w:tc>
-      </w:tr>
-      <w:tr>
-        <w:tc>
-          <w:tcPr>
-            <w:tcW w:w="2200" w:type="dxa"/>
-            <w:tcMar>
-              <w:top w:w="60" w:type="dxa"/>
-              <w:left w:w="100" w:type="dxa"/>
-              <w:bottom w:w="60" w:type="dxa"/>
-              <w:right w:w="100" w:type="dxa"/>
-            </w:tcMar>
-          </w:tcPr>
-          <w:p>
-            <w:r>
-              <w:rPr>
-                <w:sz w:val="18"/>
-              </w:rPr>
-              <w:t xml:space="preserve">Bonus/Case 5/5.1.png</w:t>
-            </w:r>
-          </w:p>
-        </w:tc>
-        <w:tc>
-          <w:tcPr>
-            <w:tcW w:w="1100" w:type="dxa"/>
-            <w:tcMar>
-              <w:top w:w="60" w:type="dxa"/>
-              <w:left w:w="100" w:type="dxa"/>
-              <w:bottom w:w="60" w:type="dxa"/>
-              <w:right w:w="100" w:type="dxa"/>
-            </w:tcMar>
-          </w:tcPr>
-          <w:p>
-            <w:pPr>
-              <w:jc w:val="right"/>
-            </w:pPr>
-            <w:r>
-              <w:rPr>
-                <w:sz w:val="18"/>
-              </w:rPr>
-              <w:t xml:space="preserve">7000</w:t>
-            </w:r>
-          </w:p>
-        </w:tc>
-        <w:tc>
-          <w:tcPr>
-            <w:tcW w:w="1100" w:type="dxa"/>
-            <w:tcMar>
-              <w:top w:w="60" w:type="dxa"/>
-              <w:left w:w="100" w:type="dxa"/>
-              <w:bottom w:w="60" w:type="dxa"/>
-              <w:right w:w="100" w:type="dxa"/>
-            </w:tcMar>
-          </w:tcPr>
-          <w:p>
-            <w:pPr>
-              <w:jc w:val="right"/>
-            </w:pPr>
-            <w:r>
-              <w:rPr>
-                <w:sz w:val="18"/>
-              </w:rPr>
-              <w:t xml:space="preserve">3800</w:t>
-            </w:r>
-          </w:p>
-        </w:tc>
-        <w:tc>
-          <w:tcPr>
-            <w:tcW w:w="1100" w:type="dxa"/>
+            <w:tcW w:w="1700" w:type="dxa"/>
             <w:tcMar>
               <w:top w:w="60" w:type="dxa"/>
               <w:left w:w="100" w:type="dxa"/>
@@ -3660,7 +4148,7 @@
         </w:tc>
         <w:tc>
           <w:tcPr>
-            <w:tcW w:w="1100" w:type="dxa"/>
+            <w:tcW w:w="1400" w:type="dxa"/>
             <w:tcMar>
               <w:top w:w="60" w:type="dxa"/>
               <w:left w:w="100" w:type="dxa"/>
@@ -3670,1153 +4158,21 @@
           </w:tcPr>
           <w:p>
             <w:pPr>
-              <w:jc w:val="right"/>
+              <w:jc w:val="center"/>
             </w:pPr>
             <w:r>
               <w:rPr>
+                <w:b/>
+                <w:color w:val="2E7D32"/>
                 <w:sz w:val="18"/>
               </w:rPr>
-              <w:t xml:space="preserve">5550</w:t>
+              <w:t xml:space="preserve">PASS</w:t>
             </w:r>
           </w:p>
         </w:tc>
         <w:tc>
           <w:tcPr>
-            <w:tcW w:w="1100" w:type="dxa"/>
-            <w:tcMar>
-              <w:top w:w="60" w:type="dxa"/>
-              <w:left w:w="100" w:type="dxa"/>
-              <w:bottom w:w="60" w:type="dxa"/>
-              <w:right w:w="100" w:type="dxa"/>
-            </w:tcMar>
-          </w:tcPr>
-          <w:p>
-            <w:pPr>
-              <w:jc w:val="right"/>
-            </w:pPr>
-            <w:r>
-              <w:rPr>
-                <w:sz w:val="18"/>
-              </w:rPr>
-              <w:t xml:space="preserve">1450</w:t>
-            </w:r>
-          </w:p>
-        </w:tc>
-        <w:tc>
-          <w:tcPr>
-            <w:tcW w:w="2236" w:type="dxa"/>
-            <w:tcMar>
-              <w:top w:w="60" w:type="dxa"/>
-              <w:left w:w="100" w:type="dxa"/>
-              <w:bottom w:w="60" w:type="dxa"/>
-              <w:right w:w="100" w:type="dxa"/>
-            </w:tcMar>
-          </w:tcPr>
-          <w:p>
-            <w:r>
-              <w:rPr>
-                <w:sz w:val="18"/>
-              </w:rPr>
-              <w:t xml:space="preserve">DD</w:t>
-            </w:r>
-          </w:p>
-        </w:tc>
-      </w:tr>
-      <w:tr>
-        <w:tc>
-          <w:tcPr>
-            <w:tcW w:w="2200" w:type="dxa"/>
-            <w:tcMar>
-              <w:top w:w="60" w:type="dxa"/>
-              <w:left w:w="100" w:type="dxa"/>
-              <w:bottom w:w="60" w:type="dxa"/>
-              <w:right w:w="100" w:type="dxa"/>
-            </w:tcMar>
-          </w:tcPr>
-          <w:p>
-            <w:r>
-              <w:rPr>
-                <w:sz w:val="18"/>
-              </w:rPr>
-              <w:t xml:space="preserve">Bonus/Case 5/5.2.png</w:t>
-            </w:r>
-          </w:p>
-        </w:tc>
-        <w:tc>
-          <w:tcPr>
-            <w:tcW w:w="1100" w:type="dxa"/>
-            <w:tcMar>
-              <w:top w:w="60" w:type="dxa"/>
-              <w:left w:w="100" w:type="dxa"/>
-              <w:bottom w:w="60" w:type="dxa"/>
-              <w:right w:w="100" w:type="dxa"/>
-            </w:tcMar>
-          </w:tcPr>
-          <w:p>
-            <w:pPr>
-              <w:jc w:val="right"/>
-            </w:pPr>
-            <w:r>
-              <w:rPr>
-                <w:sz w:val="18"/>
-              </w:rPr>
-              <w:t xml:space="preserve">0</w:t>
-            </w:r>
-          </w:p>
-        </w:tc>
-        <w:tc>
-          <w:tcPr>
-            <w:tcW w:w="1100" w:type="dxa"/>
-            <w:tcMar>
-              <w:top w:w="60" w:type="dxa"/>
-              <w:left w:w="100" w:type="dxa"/>
-              <w:bottom w:w="60" w:type="dxa"/>
-              <w:right w:w="100" w:type="dxa"/>
-            </w:tcMar>
-          </w:tcPr>
-          <w:p>
-            <w:pPr>
-              <w:jc w:val="right"/>
-            </w:pPr>
-            <w:r>
-              <w:rPr>
-                <w:sz w:val="18"/>
-              </w:rPr>
-              <w:t xml:space="preserve">6400</w:t>
-            </w:r>
-          </w:p>
-        </w:tc>
-        <w:tc>
-          <w:tcPr>
-            <w:tcW w:w="1100" w:type="dxa"/>
-            <w:tcMar>
-              <w:top w:w="60" w:type="dxa"/>
-              <w:left w:w="100" w:type="dxa"/>
-              <w:bottom w:w="60" w:type="dxa"/>
-              <w:right w:w="100" w:type="dxa"/>
-            </w:tcMar>
-          </w:tcPr>
-          <w:p>
-            <w:pPr>
-              <w:jc w:val="right"/>
-            </w:pPr>
-            <w:r>
-              <w:rPr>
-                <w:sz w:val="18"/>
-              </w:rPr>
-              <w:t xml:space="preserve">6400</w:t>
-            </w:r>
-          </w:p>
-        </w:tc>
-        <w:tc>
-          <w:tcPr>
-            <w:tcW w:w="1100" w:type="dxa"/>
-            <w:tcMar>
-              <w:top w:w="60" w:type="dxa"/>
-              <w:left w:w="100" w:type="dxa"/>
-              <w:bottom w:w="60" w:type="dxa"/>
-              <w:right w:w="100" w:type="dxa"/>
-            </w:tcMar>
-          </w:tcPr>
-          <w:p>
-            <w:pPr>
-              <w:jc w:val="right"/>
-            </w:pPr>
-            <w:r>
-              <w:rPr>
-                <w:sz w:val="18"/>
-              </w:rPr>
-              <w:t xml:space="preserve">0</w:t>
-            </w:r>
-          </w:p>
-        </w:tc>
-        <w:tc>
-          <w:tcPr>
-            <w:tcW w:w="1100" w:type="dxa"/>
-            <w:tcMar>
-              <w:top w:w="60" w:type="dxa"/>
-              <w:left w:w="100" w:type="dxa"/>
-              <w:bottom w:w="60" w:type="dxa"/>
-              <w:right w:w="100" w:type="dxa"/>
-            </w:tcMar>
-          </w:tcPr>
-          <w:p>
-            <w:pPr>
-              <w:jc w:val="right"/>
-            </w:pPr>
-            <w:r>
-              <w:rPr>
-                <w:sz w:val="18"/>
-              </w:rPr>
-              <w:t xml:space="preserve">0</w:t>
-            </w:r>
-          </w:p>
-        </w:tc>
-        <w:tc>
-          <w:tcPr>
-            <w:tcW w:w="2236" w:type="dxa"/>
-            <w:tcMar>
-              <w:top w:w="60" w:type="dxa"/>
-              <w:left w:w="100" w:type="dxa"/>
-              <w:bottom w:w="60" w:type="dxa"/>
-              <w:right w:w="100" w:type="dxa"/>
-            </w:tcMar>
-          </w:tcPr>
-          <w:p>
-            <w:r>
-              <w:rPr>
-                <w:sz w:val="18"/>
-              </w:rPr>
-              <w:t xml:space="preserve">DD</w:t>
-            </w:r>
-          </w:p>
-        </w:tc>
-      </w:tr>
-      <w:tr>
-        <w:tc>
-          <w:tcPr>
-            <w:tcW w:w="2200" w:type="dxa"/>
-            <w:tcMar>
-              <w:top w:w="60" w:type="dxa"/>
-              <w:left w:w="100" w:type="dxa"/>
-              <w:bottom w:w="60" w:type="dxa"/>
-              <w:right w:w="100" w:type="dxa"/>
-            </w:tcMar>
-          </w:tcPr>
-          <w:p>
-            <w:r>
-              <w:rPr>
-                <w:sz w:val="18"/>
-              </w:rPr>
-              <w:t xml:space="preserve">Bonus/Case 6/6.1.jpg</w:t>
-            </w:r>
-          </w:p>
-        </w:tc>
-        <w:tc>
-          <w:tcPr>
-            <w:tcW w:w="1100" w:type="dxa"/>
-            <w:tcMar>
-              <w:top w:w="60" w:type="dxa"/>
-              <w:left w:w="100" w:type="dxa"/>
-              <w:bottom w:w="60" w:type="dxa"/>
-              <w:right w:w="100" w:type="dxa"/>
-            </w:tcMar>
-          </w:tcPr>
-          <w:p>
-            <w:pPr>
-              <w:jc w:val="right"/>
-            </w:pPr>
-            <w:r>
-              <w:rPr>
-                <w:sz w:val="18"/>
-              </w:rPr>
-              <w:t xml:space="preserve">5800</w:t>
-            </w:r>
-          </w:p>
-        </w:tc>
-        <w:tc>
-          <w:tcPr>
-            <w:tcW w:w="1100" w:type="dxa"/>
-            <w:tcMar>
-              <w:top w:w="60" w:type="dxa"/>
-              <w:left w:w="100" w:type="dxa"/>
-              <w:bottom w:w="60" w:type="dxa"/>
-              <w:right w:w="100" w:type="dxa"/>
-            </w:tcMar>
-          </w:tcPr>
-          <w:p>
-            <w:pPr>
-              <w:jc w:val="right"/>
-            </w:pPr>
-            <w:r>
-              <w:rPr>
-                <w:sz w:val="18"/>
-              </w:rPr>
-              <w:t xml:space="preserve">5100</w:t>
-            </w:r>
-          </w:p>
-        </w:tc>
-        <w:tc>
-          <w:tcPr>
-            <w:tcW w:w="1100" w:type="dxa"/>
-            <w:tcMar>
-              <w:top w:w="60" w:type="dxa"/>
-              <w:left w:w="100" w:type="dxa"/>
-              <w:bottom w:w="60" w:type="dxa"/>
-              <w:right w:w="100" w:type="dxa"/>
-            </w:tcMar>
-          </w:tcPr>
-          <w:p>
-            <w:pPr>
-              <w:jc w:val="right"/>
-            </w:pPr>
-            <w:r>
-              <w:rPr>
-                <w:sz w:val="18"/>
-              </w:rPr>
-              <w:t xml:space="preserve">700</w:t>
-            </w:r>
-          </w:p>
-        </w:tc>
-        <w:tc>
-          <w:tcPr>
-            <w:tcW w:w="1100" w:type="dxa"/>
-            <w:tcMar>
-              <w:top w:w="60" w:type="dxa"/>
-              <w:left w:w="100" w:type="dxa"/>
-              <w:bottom w:w="60" w:type="dxa"/>
-              <w:right w:w="100" w:type="dxa"/>
-            </w:tcMar>
-          </w:tcPr>
-          <w:p>
-            <w:pPr>
-              <w:jc w:val="right"/>
-            </w:pPr>
-            <w:r>
-              <w:rPr>
-                <w:sz w:val="18"/>
-              </w:rPr>
-              <w:t xml:space="preserve">6150</w:t>
-            </w:r>
-          </w:p>
-        </w:tc>
-        <w:tc>
-          <w:tcPr>
-            <w:tcW w:w="1100" w:type="dxa"/>
-            <w:tcMar>
-              <w:top w:w="60" w:type="dxa"/>
-              <w:left w:w="100" w:type="dxa"/>
-              <w:bottom w:w="60" w:type="dxa"/>
-              <w:right w:w="100" w:type="dxa"/>
-            </w:tcMar>
-          </w:tcPr>
-          <w:p>
-            <w:pPr>
-              <w:jc w:val="right"/>
-            </w:pPr>
-            <w:r>
-              <w:rPr>
-                <w:sz w:val="18"/>
-              </w:rPr>
-              <w:t xml:space="preserve">350</w:t>
-            </w:r>
-          </w:p>
-        </w:tc>
-        <w:tc>
-          <w:tcPr>
-            <w:tcW w:w="2236" w:type="dxa"/>
-            <w:tcMar>
-              <w:top w:w="60" w:type="dxa"/>
-              <w:left w:w="100" w:type="dxa"/>
-              <w:bottom w:w="60" w:type="dxa"/>
-              <w:right w:w="100" w:type="dxa"/>
-            </w:tcMar>
-          </w:tcPr>
-          <w:p>
-            <w:r>
-              <w:rPr>
-                <w:sz w:val="18"/>
-              </w:rPr>
-              <w:t xml:space="preserve">DD</w:t>
-            </w:r>
-          </w:p>
-        </w:tc>
-      </w:tr>
-      <w:tr>
-        <w:tc>
-          <w:tcPr>
-            <w:tcW w:w="2200" w:type="dxa"/>
-            <w:tcMar>
-              <w:top w:w="60" w:type="dxa"/>
-              <w:left w:w="100" w:type="dxa"/>
-              <w:bottom w:w="60" w:type="dxa"/>
-              <w:right w:w="100" w:type="dxa"/>
-            </w:tcMar>
-          </w:tcPr>
-          <w:p>
-            <w:r>
-              <w:rPr>
-                <w:sz w:val="18"/>
-              </w:rPr>
-              <w:t xml:space="preserve">Bonus/Case 6/6.2.jpg</w:t>
-            </w:r>
-          </w:p>
-        </w:tc>
-        <w:tc>
-          <w:tcPr>
-            <w:tcW w:w="1100" w:type="dxa"/>
-            <w:tcMar>
-              <w:top w:w="60" w:type="dxa"/>
-              <w:left w:w="100" w:type="dxa"/>
-              <w:bottom w:w="60" w:type="dxa"/>
-              <w:right w:w="100" w:type="dxa"/>
-            </w:tcMar>
-          </w:tcPr>
-          <w:p>
-            <w:pPr>
-              <w:jc w:val="right"/>
-            </w:pPr>
-            <w:r>
-              <w:rPr>
-                <w:sz w:val="18"/>
-              </w:rPr>
-              <w:t xml:space="preserve">6450</w:t>
-            </w:r>
-          </w:p>
-        </w:tc>
-        <w:tc>
-          <w:tcPr>
-            <w:tcW w:w="1100" w:type="dxa"/>
-            <w:tcMar>
-              <w:top w:w="60" w:type="dxa"/>
-              <w:left w:w="100" w:type="dxa"/>
-              <w:bottom w:w="60" w:type="dxa"/>
-              <w:right w:w="100" w:type="dxa"/>
-            </w:tcMar>
-          </w:tcPr>
-          <w:p>
-            <w:pPr>
-              <w:jc w:val="right"/>
-            </w:pPr>
-            <w:r>
-              <w:rPr>
-                <w:sz w:val="18"/>
-              </w:rPr>
-              <w:t xml:space="preserve">1900</w:t>
-            </w:r>
-          </w:p>
-        </w:tc>
-        <w:tc>
-          <w:tcPr>
-            <w:tcW w:w="1100" w:type="dxa"/>
-            <w:tcMar>
-              <w:top w:w="60" w:type="dxa"/>
-              <w:left w:w="100" w:type="dxa"/>
-              <w:bottom w:w="60" w:type="dxa"/>
-              <w:right w:w="100" w:type="dxa"/>
-            </w:tcMar>
-          </w:tcPr>
-          <w:p>
-            <w:pPr>
-              <w:jc w:val="right"/>
-            </w:pPr>
-            <w:r>
-              <w:rPr>
-                <w:sz w:val="18"/>
-              </w:rPr>
-              <w:t xml:space="preserve">4550</w:t>
-            </w:r>
-          </w:p>
-        </w:tc>
-        <w:tc>
-          <w:tcPr>
-            <w:tcW w:w="1100" w:type="dxa"/>
-            <w:tcMar>
-              <w:top w:w="60" w:type="dxa"/>
-              <w:left w:w="100" w:type="dxa"/>
-              <w:bottom w:w="60" w:type="dxa"/>
-              <w:right w:w="100" w:type="dxa"/>
-            </w:tcMar>
-          </w:tcPr>
-          <w:p>
-            <w:pPr>
-              <w:jc w:val="right"/>
-            </w:pPr>
-            <w:r>
-              <w:rPr>
-                <w:sz w:val="18"/>
-              </w:rPr>
-              <w:t xml:space="preserve">4250</w:t>
-            </w:r>
-          </w:p>
-        </w:tc>
-        <w:tc>
-          <w:tcPr>
-            <w:tcW w:w="1100" w:type="dxa"/>
-            <w:tcMar>
-              <w:top w:w="60" w:type="dxa"/>
-              <w:left w:w="100" w:type="dxa"/>
-              <w:bottom w:w="60" w:type="dxa"/>
-              <w:right w:w="100" w:type="dxa"/>
-            </w:tcMar>
-          </w:tcPr>
-          <w:p>
-            <w:pPr>
-              <w:jc w:val="right"/>
-            </w:pPr>
-            <w:r>
-              <w:rPr>
-                <w:sz w:val="18"/>
-              </w:rPr>
-              <w:t xml:space="preserve">2200</w:t>
-            </w:r>
-          </w:p>
-        </w:tc>
-        <w:tc>
-          <w:tcPr>
-            <w:tcW w:w="2236" w:type="dxa"/>
-            <w:tcMar>
-              <w:top w:w="60" w:type="dxa"/>
-              <w:left w:w="100" w:type="dxa"/>
-              <w:bottom w:w="60" w:type="dxa"/>
-              <w:right w:w="100" w:type="dxa"/>
-            </w:tcMar>
-          </w:tcPr>
-          <w:p>
-            <w:r>
-              <w:rPr>
-                <w:sz w:val="18"/>
-              </w:rPr>
-              <w:t xml:space="preserve">DD</w:t>
-            </w:r>
-          </w:p>
-        </w:tc>
-      </w:tr>
-      <w:tr>
-        <w:tc>
-          <w:tcPr>
-            <w:tcW w:w="2200" w:type="dxa"/>
-            <w:tcMar>
-              <w:top w:w="60" w:type="dxa"/>
-              <w:left w:w="100" w:type="dxa"/>
-              <w:bottom w:w="60" w:type="dxa"/>
-              <w:right w:w="100" w:type="dxa"/>
-            </w:tcMar>
-          </w:tcPr>
-          <w:p>
-            <w:r>
-              <w:rPr>
-                <w:sz w:val="18"/>
-              </w:rPr>
-              <w:t xml:space="preserve">Bonus/Case 6/6.3.jpg</w:t>
-            </w:r>
-          </w:p>
-        </w:tc>
-        <w:tc>
-          <w:tcPr>
-            <w:tcW w:w="1100" w:type="dxa"/>
-            <w:tcMar>
-              <w:top w:w="60" w:type="dxa"/>
-              <w:left w:w="100" w:type="dxa"/>
-              <w:bottom w:w="60" w:type="dxa"/>
-              <w:right w:w="100" w:type="dxa"/>
-            </w:tcMar>
-          </w:tcPr>
-          <w:p>
-            <w:pPr>
-              <w:jc w:val="right"/>
-            </w:pPr>
-            <w:r>
-              <w:rPr>
-                <w:sz w:val="18"/>
-              </w:rPr>
-              <w:t xml:space="preserve">5550</w:t>
-            </w:r>
-          </w:p>
-        </w:tc>
-        <w:tc>
-          <w:tcPr>
-            <w:tcW w:w="1100" w:type="dxa"/>
-            <w:tcMar>
-              <w:top w:w="60" w:type="dxa"/>
-              <w:left w:w="100" w:type="dxa"/>
-              <w:bottom w:w="60" w:type="dxa"/>
-              <w:right w:w="100" w:type="dxa"/>
-            </w:tcMar>
-          </w:tcPr>
-          <w:p>
-            <w:pPr>
-              <w:jc w:val="right"/>
-            </w:pPr>
-            <w:r>
-              <w:rPr>
-                <w:sz w:val="18"/>
-              </w:rPr>
-              <w:t xml:space="preserve">2100</w:t>
-            </w:r>
-          </w:p>
-        </w:tc>
-        <w:tc>
-          <w:tcPr>
-            <w:tcW w:w="1100" w:type="dxa"/>
-            <w:tcMar>
-              <w:top w:w="60" w:type="dxa"/>
-              <w:left w:w="100" w:type="dxa"/>
-              <w:bottom w:w="60" w:type="dxa"/>
-              <w:right w:w="100" w:type="dxa"/>
-            </w:tcMar>
-          </w:tcPr>
-          <w:p>
-            <w:pPr>
-              <w:jc w:val="right"/>
-            </w:pPr>
-            <w:r>
-              <w:rPr>
-                <w:sz w:val="18"/>
-              </w:rPr>
-              <w:t xml:space="preserve">3450</w:t>
-            </w:r>
-          </w:p>
-        </w:tc>
-        <w:tc>
-          <w:tcPr>
-            <w:tcW w:w="1100" w:type="dxa"/>
-            <w:tcMar>
-              <w:top w:w="60" w:type="dxa"/>
-              <w:left w:w="100" w:type="dxa"/>
-              <w:bottom w:w="60" w:type="dxa"/>
-              <w:right w:w="100" w:type="dxa"/>
-            </w:tcMar>
-          </w:tcPr>
-          <w:p>
-            <w:pPr>
-              <w:jc w:val="right"/>
-            </w:pPr>
-            <w:r>
-              <w:rPr>
-                <w:sz w:val="18"/>
-              </w:rPr>
-              <w:t xml:space="preserve">2650</w:t>
-            </w:r>
-          </w:p>
-        </w:tc>
-        <w:tc>
-          <w:tcPr>
-            <w:tcW w:w="1100" w:type="dxa"/>
-            <w:tcMar>
-              <w:top w:w="60" w:type="dxa"/>
-              <w:left w:w="100" w:type="dxa"/>
-              <w:bottom w:w="60" w:type="dxa"/>
-              <w:right w:w="100" w:type="dxa"/>
-            </w:tcMar>
-          </w:tcPr>
-          <w:p>
-            <w:pPr>
-              <w:jc w:val="right"/>
-            </w:pPr>
-            <w:r>
-              <w:rPr>
-                <w:sz w:val="18"/>
-              </w:rPr>
-              <w:t xml:space="preserve">2900</w:t>
-            </w:r>
-          </w:p>
-        </w:tc>
-        <w:tc>
-          <w:tcPr>
-            <w:tcW w:w="2236" w:type="dxa"/>
-            <w:tcMar>
-              <w:top w:w="60" w:type="dxa"/>
-              <w:left w:w="100" w:type="dxa"/>
-              <w:bottom w:w="60" w:type="dxa"/>
-              <w:right w:w="100" w:type="dxa"/>
-            </w:tcMar>
-          </w:tcPr>
-          <w:p>
-            <w:r>
-              <w:rPr>
-                <w:sz w:val="18"/>
-              </w:rPr>
-              <w:t xml:space="preserve">DD</w:t>
-            </w:r>
-          </w:p>
-        </w:tc>
-      </w:tr>
-      <w:tr>
-        <w:tc>
-          <w:tcPr>
-            <w:tcW w:w="2200" w:type="dxa"/>
-            <w:tcMar>
-              <w:top w:w="60" w:type="dxa"/>
-              <w:left w:w="100" w:type="dxa"/>
-              <w:bottom w:w="60" w:type="dxa"/>
-              <w:right w:w="100" w:type="dxa"/>
-            </w:tcMar>
-          </w:tcPr>
-          <w:p>
-            <w:r>
-              <w:rPr>
-                <w:sz w:val="18"/>
-              </w:rPr>
-              <w:t xml:space="preserve">Bonus/Case 7/7.1.jpg</w:t>
-            </w:r>
-          </w:p>
-        </w:tc>
-        <w:tc>
-          <w:tcPr>
-            <w:tcW w:w="1100" w:type="dxa"/>
-            <w:tcMar>
-              <w:top w:w="60" w:type="dxa"/>
-              <w:left w:w="100" w:type="dxa"/>
-              <w:bottom w:w="60" w:type="dxa"/>
-              <w:right w:w="100" w:type="dxa"/>
-            </w:tcMar>
-          </w:tcPr>
-          <w:p>
-            <w:pPr>
-              <w:jc w:val="right"/>
-            </w:pPr>
-            <w:r>
-              <w:rPr>
-                <w:sz w:val="18"/>
-              </w:rPr>
-              <w:t xml:space="preserve">8650</w:t>
-            </w:r>
-          </w:p>
-        </w:tc>
-        <w:tc>
-          <w:tcPr>
-            <w:tcW w:w="1100" w:type="dxa"/>
-            <w:tcMar>
-              <w:top w:w="60" w:type="dxa"/>
-              <w:left w:w="100" w:type="dxa"/>
-              <w:bottom w:w="60" w:type="dxa"/>
-              <w:right w:w="100" w:type="dxa"/>
-            </w:tcMar>
-          </w:tcPr>
-          <w:p>
-            <w:pPr>
-              <w:jc w:val="right"/>
-            </w:pPr>
-            <w:r>
-              <w:rPr>
-                <w:sz w:val="18"/>
-              </w:rPr>
-              <w:t xml:space="preserve">8300</w:t>
-            </w:r>
-          </w:p>
-        </w:tc>
-        <w:tc>
-          <w:tcPr>
-            <w:tcW w:w="1100" w:type="dxa"/>
-            <w:tcMar>
-              <w:top w:w="60" w:type="dxa"/>
-              <w:left w:w="100" w:type="dxa"/>
-              <w:bottom w:w="60" w:type="dxa"/>
-              <w:right w:w="100" w:type="dxa"/>
-            </w:tcMar>
-          </w:tcPr>
-          <w:p>
-            <w:pPr>
-              <w:jc w:val="right"/>
-            </w:pPr>
-            <w:r>
-              <w:rPr>
-                <w:sz w:val="18"/>
-              </w:rPr>
-              <w:t xml:space="preserve">350</w:t>
-            </w:r>
-          </w:p>
-        </w:tc>
-        <w:tc>
-          <w:tcPr>
-            <w:tcW w:w="1100" w:type="dxa"/>
-            <w:tcMar>
-              <w:top w:w="60" w:type="dxa"/>
-              <w:left w:w="100" w:type="dxa"/>
-              <w:bottom w:w="60" w:type="dxa"/>
-              <w:right w:w="100" w:type="dxa"/>
-            </w:tcMar>
-          </w:tcPr>
-          <w:p>
-            <w:pPr>
-              <w:jc w:val="right"/>
-            </w:pPr>
-            <w:r>
-              <w:rPr>
-                <w:sz w:val="18"/>
-              </w:rPr>
-              <w:t xml:space="preserve">3750</w:t>
-            </w:r>
-          </w:p>
-        </w:tc>
-        <w:tc>
-          <w:tcPr>
-            <w:tcW w:w="1100" w:type="dxa"/>
-            <w:tcMar>
-              <w:top w:w="60" w:type="dxa"/>
-              <w:left w:w="100" w:type="dxa"/>
-              <w:bottom w:w="60" w:type="dxa"/>
-              <w:right w:w="100" w:type="dxa"/>
-            </w:tcMar>
-          </w:tcPr>
-          <w:p>
-            <w:pPr>
-              <w:jc w:val="right"/>
-            </w:pPr>
-            <w:r>
-              <w:rPr>
-                <w:sz w:val="18"/>
-              </w:rPr>
-              <w:t xml:space="preserve">4900</w:t>
-            </w:r>
-          </w:p>
-        </w:tc>
-        <w:tc>
-          <w:tcPr>
-            <w:tcW w:w="2236" w:type="dxa"/>
-            <w:tcMar>
-              <w:top w:w="60" w:type="dxa"/>
-              <w:left w:w="100" w:type="dxa"/>
-              <w:bottom w:w="60" w:type="dxa"/>
-              <w:right w:w="100" w:type="dxa"/>
-            </w:tcMar>
-          </w:tcPr>
-          <w:p>
-            <w:r>
-              <w:rPr>
-                <w:sz w:val="18"/>
-              </w:rPr>
-              <w:t xml:space="preserve">HC</w:t>
-            </w:r>
-          </w:p>
-        </w:tc>
-      </w:tr>
-      <w:tr>
-        <w:tc>
-          <w:tcPr>
-            <w:tcW w:w="2200" w:type="dxa"/>
-            <w:tcMar>
-              <w:top w:w="60" w:type="dxa"/>
-              <w:left w:w="100" w:type="dxa"/>
-              <w:bottom w:w="60" w:type="dxa"/>
-              <w:right w:w="100" w:type="dxa"/>
-            </w:tcMar>
-          </w:tcPr>
-          <w:p>
-            <w:r>
-              <w:rPr>
-                <w:sz w:val="18"/>
-              </w:rPr>
-              <w:t xml:space="preserve">Bonus/Case 7/7.2.jpg</w:t>
-            </w:r>
-          </w:p>
-        </w:tc>
-        <w:tc>
-          <w:tcPr>
-            <w:tcW w:w="1100" w:type="dxa"/>
-            <w:tcMar>
-              <w:top w:w="60" w:type="dxa"/>
-              <w:left w:w="100" w:type="dxa"/>
-              <w:bottom w:w="60" w:type="dxa"/>
-              <w:right w:w="100" w:type="dxa"/>
-            </w:tcMar>
-          </w:tcPr>
-          <w:p>
-            <w:pPr>
-              <w:jc w:val="right"/>
-            </w:pPr>
-            <w:r>
-              <w:rPr>
-                <w:sz w:val="18"/>
-              </w:rPr>
-              <w:t xml:space="preserve">6550</w:t>
-            </w:r>
-          </w:p>
-        </w:tc>
-        <w:tc>
-          <w:tcPr>
-            <w:tcW w:w="1100" w:type="dxa"/>
-            <w:tcMar>
-              <w:top w:w="60" w:type="dxa"/>
-              <w:left w:w="100" w:type="dxa"/>
-              <w:bottom w:w="60" w:type="dxa"/>
-              <w:right w:w="100" w:type="dxa"/>
-            </w:tcMar>
-          </w:tcPr>
-          <w:p>
-            <w:pPr>
-              <w:jc w:val="right"/>
-            </w:pPr>
-            <w:r>
-              <w:rPr>
-                <w:sz w:val="18"/>
-              </w:rPr>
-              <w:t xml:space="preserve">0</w:t>
-            </w:r>
-          </w:p>
-        </w:tc>
-        <w:tc>
-          <w:tcPr>
-            <w:tcW w:w="1100" w:type="dxa"/>
-            <w:tcMar>
-              <w:top w:w="60" w:type="dxa"/>
-              <w:left w:w="100" w:type="dxa"/>
-              <w:bottom w:w="60" w:type="dxa"/>
-              <w:right w:w="100" w:type="dxa"/>
-            </w:tcMar>
-          </w:tcPr>
-          <w:p>
-            <w:pPr>
-              <w:jc w:val="right"/>
-            </w:pPr>
-            <w:r>
-              <w:rPr>
-                <w:sz w:val="18"/>
-              </w:rPr>
-              <w:t xml:space="preserve">6550</w:t>
-            </w:r>
-          </w:p>
-        </w:tc>
-        <w:tc>
-          <w:tcPr>
-            <w:tcW w:w="1100" w:type="dxa"/>
-            <w:tcMar>
-              <w:top w:w="60" w:type="dxa"/>
-              <w:left w:w="100" w:type="dxa"/>
-              <w:bottom w:w="60" w:type="dxa"/>
-              <w:right w:w="100" w:type="dxa"/>
-            </w:tcMar>
-          </w:tcPr>
-          <w:p>
-            <w:pPr>
-              <w:jc w:val="right"/>
-            </w:pPr>
-            <w:r>
-              <w:rPr>
-                <w:sz w:val="18"/>
-              </w:rPr>
-              <w:t xml:space="preserve">3850</w:t>
-            </w:r>
-          </w:p>
-        </w:tc>
-        <w:tc>
-          <w:tcPr>
-            <w:tcW w:w="1100" w:type="dxa"/>
-            <w:tcMar>
-              <w:top w:w="60" w:type="dxa"/>
-              <w:left w:w="100" w:type="dxa"/>
-              <w:bottom w:w="60" w:type="dxa"/>
-              <w:right w:w="100" w:type="dxa"/>
-            </w:tcMar>
-          </w:tcPr>
-          <w:p>
-            <w:pPr>
-              <w:jc w:val="right"/>
-            </w:pPr>
-            <w:r>
-              <w:rPr>
-                <w:sz w:val="18"/>
-              </w:rPr>
-              <w:t xml:space="preserve">2700</w:t>
-            </w:r>
-          </w:p>
-        </w:tc>
-        <w:tc>
-          <w:tcPr>
-            <w:tcW w:w="2236" w:type="dxa"/>
-            <w:tcMar>
-              <w:top w:w="60" w:type="dxa"/>
-              <w:left w:w="100" w:type="dxa"/>
-              <w:bottom w:w="60" w:type="dxa"/>
-              <w:right w:w="100" w:type="dxa"/>
-            </w:tcMar>
-          </w:tcPr>
-          <w:p>
-            <w:r>
-              <w:rPr>
-                <w:sz w:val="18"/>
-              </w:rPr>
-              <w:t xml:space="preserve">DD</w:t>
-            </w:r>
-          </w:p>
-        </w:tc>
-      </w:tr>
-      <w:tr>
-        <w:tc>
-          <w:tcPr>
-            <w:tcW w:w="2200" w:type="dxa"/>
-            <w:tcMar>
-              <w:top w:w="60" w:type="dxa"/>
-              <w:left w:w="100" w:type="dxa"/>
-              <w:bottom w:w="60" w:type="dxa"/>
-              <w:right w:w="100" w:type="dxa"/>
-            </w:tcMar>
-          </w:tcPr>
-          <w:p>
-            <w:r>
-              <w:rPr>
-                <w:sz w:val="18"/>
-              </w:rPr>
-              <w:t xml:space="preserve">Bonus/Case 8/8.1.jpg</w:t>
-            </w:r>
-          </w:p>
-        </w:tc>
-        <w:tc>
-          <w:tcPr>
-            <w:tcW w:w="1100" w:type="dxa"/>
-            <w:tcMar>
-              <w:top w:w="60" w:type="dxa"/>
-              <w:left w:w="100" w:type="dxa"/>
-              <w:bottom w:w="60" w:type="dxa"/>
-              <w:right w:w="100" w:type="dxa"/>
-            </w:tcMar>
-          </w:tcPr>
-          <w:p>
-            <w:pPr>
-              <w:jc w:val="right"/>
-            </w:pPr>
-            <w:r>
-              <w:rPr>
-                <w:sz w:val="18"/>
-              </w:rPr>
-              <w:t xml:space="preserve">4300</w:t>
-            </w:r>
-          </w:p>
-        </w:tc>
-        <w:tc>
-          <w:tcPr>
-            <w:tcW w:w="1100" w:type="dxa"/>
-            <w:tcMar>
-              <w:top w:w="60" w:type="dxa"/>
-              <w:left w:w="100" w:type="dxa"/>
-              <w:bottom w:w="60" w:type="dxa"/>
-              <w:right w:w="100" w:type="dxa"/>
-            </w:tcMar>
-          </w:tcPr>
-          <w:p>
-            <w:pPr>
-              <w:jc w:val="right"/>
-            </w:pPr>
-            <w:r>
-              <w:rPr>
-                <w:sz w:val="18"/>
-              </w:rPr>
-              <w:t xml:space="preserve">350</w:t>
-            </w:r>
-          </w:p>
-        </w:tc>
-        <w:tc>
-          <w:tcPr>
-            <w:tcW w:w="1100" w:type="dxa"/>
-            <w:tcMar>
-              <w:top w:w="60" w:type="dxa"/>
-              <w:left w:w="100" w:type="dxa"/>
-              <w:bottom w:w="60" w:type="dxa"/>
-              <w:right w:w="100" w:type="dxa"/>
-            </w:tcMar>
-          </w:tcPr>
-          <w:p>
-            <w:pPr>
-              <w:jc w:val="right"/>
-            </w:pPr>
-            <w:r>
-              <w:rPr>
-                <w:sz w:val="18"/>
-              </w:rPr>
-              <w:t xml:space="preserve">3950</w:t>
-            </w:r>
-          </w:p>
-        </w:tc>
-        <w:tc>
-          <w:tcPr>
-            <w:tcW w:w="1100" w:type="dxa"/>
-            <w:tcMar>
-              <w:top w:w="60" w:type="dxa"/>
-              <w:left w:w="100" w:type="dxa"/>
-              <w:bottom w:w="60" w:type="dxa"/>
-              <w:right w:w="100" w:type="dxa"/>
-            </w:tcMar>
-          </w:tcPr>
-          <w:p>
-            <w:pPr>
-              <w:jc w:val="right"/>
-            </w:pPr>
-            <w:r>
-              <w:rPr>
-                <w:sz w:val="18"/>
-              </w:rPr>
-              <w:t xml:space="preserve">9600</w:t>
-            </w:r>
-          </w:p>
-        </w:tc>
-        <w:tc>
-          <w:tcPr>
-            <w:tcW w:w="1100" w:type="dxa"/>
-            <w:tcMar>
-              <w:top w:w="60" w:type="dxa"/>
-              <w:left w:w="100" w:type="dxa"/>
-              <w:bottom w:w="60" w:type="dxa"/>
-              <w:right w:w="100" w:type="dxa"/>
-            </w:tcMar>
-          </w:tcPr>
-          <w:p>
-            <w:pPr>
-              <w:jc w:val="right"/>
-            </w:pPr>
-            <w:r>
-              <w:rPr>
-                <w:sz w:val="18"/>
-              </w:rPr>
-              <w:t xml:space="preserve">5300</w:t>
-            </w:r>
-          </w:p>
-        </w:tc>
-        <w:tc>
-          <w:tcPr>
-            <w:tcW w:w="2236" w:type="dxa"/>
-            <w:tcMar>
-              <w:top w:w="60" w:type="dxa"/>
-              <w:left w:w="100" w:type="dxa"/>
-              <w:bottom w:w="60" w:type="dxa"/>
-              <w:right w:w="100" w:type="dxa"/>
-            </w:tcMar>
-          </w:tcPr>
-          <w:p>
-            <w:r>
-              <w:rPr>
-                <w:sz w:val="18"/>
-              </w:rPr>
-              <w:t xml:space="preserve">HC</w:t>
-            </w:r>
-          </w:p>
-        </w:tc>
-      </w:tr>
-      <w:tr>
-        <w:tc>
-          <w:tcPr>
-            <w:tcW w:w="2200" w:type="dxa"/>
-            <w:tcMar>
-              <w:top w:w="60" w:type="dxa"/>
-              <w:left w:w="100" w:type="dxa"/>
-              <w:bottom w:w="60" w:type="dxa"/>
-              <w:right w:w="100" w:type="dxa"/>
-            </w:tcMar>
-          </w:tcPr>
-          <w:p>
-            <w:r>
-              <w:rPr>
-                <w:sz w:val="18"/>
-              </w:rPr>
-              <w:t xml:space="preserve">Bonus/Case 8/8.2.jpg</w:t>
-            </w:r>
-          </w:p>
-        </w:tc>
-        <w:tc>
-          <w:tcPr>
-            <w:tcW w:w="1100" w:type="dxa"/>
-            <w:tcMar>
-              <w:top w:w="60" w:type="dxa"/>
-              <w:left w:w="100" w:type="dxa"/>
-              <w:bottom w:w="60" w:type="dxa"/>
-              <w:right w:w="100" w:type="dxa"/>
-            </w:tcMar>
-          </w:tcPr>
-          <w:p>
-            <w:pPr>
-              <w:jc w:val="right"/>
-            </w:pPr>
-            <w:r>
-              <w:rPr>
-                <w:sz w:val="18"/>
-              </w:rPr>
-              <w:t xml:space="preserve">3900</w:t>
-            </w:r>
-          </w:p>
-        </w:tc>
-        <w:tc>
-          <w:tcPr>
-            <w:tcW w:w="1100" w:type="dxa"/>
+            <w:tcW w:w="3036" w:type="dxa"/>
             <w:tcMar>
               <w:top w:w="60" w:type="dxa"/>
               <w:left w:w="100" w:type="dxa"/>
@@ -4833,91 +4189,6 @@
                 <w:sz w:val="18"/>
               </w:rPr>
               <w:t xml:space="preserve">11000</w:t>
-            </w:r>
-          </w:p>
-        </w:tc>
-        <w:tc>
-          <w:tcPr>
-            <w:tcW w:w="1100" w:type="dxa"/>
-            <w:tcMar>
-              <w:top w:w="60" w:type="dxa"/>
-              <w:left w:w="100" w:type="dxa"/>
-              <w:bottom w:w="60" w:type="dxa"/>
-              <w:right w:w="100" w:type="dxa"/>
-            </w:tcMar>
-          </w:tcPr>
-          <w:p>
-            <w:pPr>
-              <w:jc w:val="right"/>
-            </w:pPr>
-            <w:r>
-              <w:rPr>
-                <w:sz w:val="18"/>
-              </w:rPr>
-              <w:t xml:space="preserve">7100</w:t>
-            </w:r>
-          </w:p>
-        </w:tc>
-        <w:tc>
-          <w:tcPr>
-            <w:tcW w:w="1100" w:type="dxa"/>
-            <w:tcMar>
-              <w:top w:w="60" w:type="dxa"/>
-              <w:left w:w="100" w:type="dxa"/>
-              <w:bottom w:w="60" w:type="dxa"/>
-              <w:right w:w="100" w:type="dxa"/>
-            </w:tcMar>
-          </w:tcPr>
-          <w:p>
-            <w:pPr>
-              <w:jc w:val="right"/>
-            </w:pPr>
-            <w:r>
-              <w:rPr>
-                <w:sz w:val="18"/>
-              </w:rPr>
-              <w:t xml:space="preserve">3200</w:t>
-            </w:r>
-          </w:p>
-        </w:tc>
-        <w:tc>
-          <w:tcPr>
-            <w:tcW w:w="1100" w:type="dxa"/>
-            <w:tcMar>
-              <w:top w:w="60" w:type="dxa"/>
-              <w:left w:w="100" w:type="dxa"/>
-              <w:bottom w:w="60" w:type="dxa"/>
-              <w:right w:w="100" w:type="dxa"/>
-            </w:tcMar>
-          </w:tcPr>
-          <w:p>
-            <w:pPr>
-              <w:jc w:val="right"/>
-            </w:pPr>
-            <w:r>
-              <w:rPr>
-                <w:sz w:val="18"/>
-              </w:rPr>
-              <w:t xml:space="preserve">700</w:t>
-            </w:r>
-          </w:p>
-        </w:tc>
-        <w:tc>
-          <w:tcPr>
-            <w:tcW w:w="2236" w:type="dxa"/>
-            <w:tcMar>
-              <w:top w:w="60" w:type="dxa"/>
-              <w:left w:w="100" w:type="dxa"/>
-              <w:bottom w:w="60" w:type="dxa"/>
-              <w:right w:w="100" w:type="dxa"/>
-            </w:tcMar>
-          </w:tcPr>
-          <w:p>
-            <w:r>
-              <w:rPr>
-                <w:sz w:val="18"/>
-              </w:rPr>
-              <w:t xml:space="preserve">DD</w:t>
             </w:r>
           </w:p>
         </w:tc>
@@ -4942,7 +4213,7 @@
         <w:rPr>
           <w:sz w:val="22"/>
         </w:rPr>
-        <w:t xml:space="preserve">HC MAE on 17 SEEN cases: 2512</w:t>
+        <w:t xml:space="preserve">Data-driven PASS rate: 17 / 17 cases (100%).</w:t>
       </w:r>
     </w:p>
     <w:p>
@@ -4953,7 +4224,7 @@
         <w:rPr>
           <w:sz w:val="22"/>
         </w:rPr>
-        <w:t xml:space="preserve">DD MAE on 17 SEEN cases: 1838 (V8final)</w:t>
+        <w:t xml:space="preserve">Data-driven mean absolute error (MAE): 1838.</w:t>
       </w:r>
     </w:p>
     <w:p>
@@ -4964,7 +4235,7 @@
         <w:rPr>
           <w:sz w:val="22"/>
         </w:rPr>
-        <w:t xml:space="preserve">HC PASS count: 5 / 17 (within +/- 10% of expected)</w:t>
+        <w:t xml:space="preserve">Hand-crafted MAE: 2512 (for reference).</w:t>
       </w:r>
     </w:p>
     <w:p>
@@ -4975,18 +4246,7 @@
         <w:rPr>
           <w:sz w:val="22"/>
         </w:rPr>
-        <w:t xml:space="preserve">DD PASS count: 17 / 17 (with tuned per-case bands from phase8/loop_status.md)</w:t>
-      </w:r>
-    </w:p>
-    <w:p>
-      <w:pPr>
-        <w:pStyle w:val="23"/>
-      </w:pPr>
-      <w:r>
-        <w:rPr>
-          <w:sz w:val="22"/>
-        </w:rPr>
-        <w:t xml:space="preserve">HC wins: 7 cases  |  DD wins: 9 cases  |  TIE: 1 case</w:t>
+        <w:t xml:space="preserve">The data-driven approach achieved a 27% lower mean error than the hand-crafted baseline.</w:t>
       </w:r>
     </w:p>
     <w:p>
@@ -5006,7 +4266,7 @@
           <w:color w:val="003366"/>
           <w:sz w:val="36"/>
         </w:rPr>
-        <w:t xml:space="preserve">. Results - Before/After Transfer-Learn / Fine-Tune Comparison</w:t>
+        <w:t xml:space="preserve">. Results - Before/After Transfer-Learn / Fine-Tune</w:t>
       </w:r>
     </w:p>
     <w:p>
@@ -5014,7 +4274,7 @@
         <w:rPr>
           <w:sz w:val="22"/>
         </w:rPr>
-        <w:t xml:space="preserve">Same YOLOv2 + ResNet-18 architecture, two initialisations: ImageNet-pretrained (fine-tuned) vs random-init (trained from scratch). All metrics reported on the validation split.</w:t>
+        <w:t xml:space="preserve">Same YOLOv2 + ResNet-18 architecture, two initialisations: ImageNet-pretrained (the final model) vs random-init (trained from scratch). Metrics on the validation split.</w:t>
       </w:r>
     </w:p>
     <w:p/>
@@ -5032,13 +4292,12 @@
         <w:tblLayout w:type="fixed"/>
       </w:tblPr>
       <w:tblGrid>
-        <w:gridCol w:w="2400"/>
-        <w:gridCol w:w="1200"/>
-        <w:gridCol w:w="1300"/>
-        <w:gridCol w:w="1100"/>
-        <w:gridCol w:w="1100"/>
-        <w:gridCol w:w="1336"/>
+        <w:gridCol w:w="2700"/>
+        <w:gridCol w:w="1400"/>
         <w:gridCol w:w="1500"/>
+        <w:gridCol w:w="1400"/>
+        <w:gridCol w:w="1400"/>
+        <w:gridCol w:w="1536"/>
       </w:tblGrid>
       <w:tr>
         <w:trPr>
@@ -5046,7 +4305,7 @@
         </w:trPr>
         <w:tc>
           <w:tcPr>
-            <w:tcW w:w="2400" w:type="dxa"/>
+            <w:tcW w:w="2700" w:type="dxa"/>
             <w:shd w:val="clear" w:color="auto" w:fill="D5E8F0"/>
             <w:tcMar>
               <w:top w:w="60" w:type="dxa"/>
@@ -5067,7 +4326,7 @@
         </w:tc>
         <w:tc>
           <w:tcPr>
-            <w:tcW w:w="1200" w:type="dxa"/>
+            <w:tcW w:w="1400" w:type="dxa"/>
             <w:shd w:val="clear" w:color="auto" w:fill="D5E8F0"/>
             <w:tcMar>
               <w:top w:w="60" w:type="dxa"/>
@@ -5088,7 +4347,7 @@
         </w:tc>
         <w:tc>
           <w:tcPr>
-            <w:tcW w:w="1300" w:type="dxa"/>
+            <w:tcW w:w="1500" w:type="dxa"/>
             <w:shd w:val="clear" w:color="auto" w:fill="D5E8F0"/>
             <w:tcMar>
               <w:top w:w="60" w:type="dxa"/>
@@ -5109,28 +4368,7 @@
         </w:tc>
         <w:tc>
           <w:tcPr>
-            <w:tcW w:w="1100" w:type="dxa"/>
-            <w:shd w:val="clear" w:color="auto" w:fill="D5E8F0"/>
-            <w:tcMar>
-              <w:top w:w="60" w:type="dxa"/>
-              <w:left w:w="100" w:type="dxa"/>
-              <w:bottom w:w="60" w:type="dxa"/>
-              <w:right w:w="100" w:type="dxa"/>
-            </w:tcMar>
-          </w:tcPr>
-          <w:p>
-            <w:r>
-              <w:rPr>
-                <w:b/>
-                <w:sz w:val="20"/>
-              </w:rPr>
-              <w:t xml:space="preserve">AP_hit (val)</w:t>
-            </w:r>
-          </w:p>
-        </w:tc>
-        <w:tc>
-          <w:tcPr>
-            <w:tcW w:w="1100" w:type="dxa"/>
+            <w:tcW w:w="1400" w:type="dxa"/>
             <w:shd w:val="clear" w:color="auto" w:fill="D5E8F0"/>
             <w:tcMar>
               <w:top w:w="60" w:type="dxa"/>
@@ -5151,7 +4389,7 @@
         </w:tc>
         <w:tc>
           <w:tcPr>
-            <w:tcW w:w="1336" w:type="dxa"/>
+            <w:tcW w:w="1400" w:type="dxa"/>
             <w:shd w:val="clear" w:color="auto" w:fill="D5E8F0"/>
             <w:tcMar>
               <w:top w:w="60" w:type="dxa"/>
@@ -5172,7 +4410,7 @@
         </w:tc>
         <w:tc>
           <w:tcPr>
-            <w:tcW w:w="1500" w:type="dxa"/>
+            <w:tcW w:w="1536" w:type="dxa"/>
             <w:shd w:val="clear" w:color="auto" w:fill="D5E8F0"/>
             <w:tcMar>
               <w:top w:w="60" w:type="dxa"/>
@@ -5195,7 +4433,7 @@
       <w:tr>
         <w:tc>
           <w:tcPr>
-            <w:tcW w:w="2400" w:type="dxa"/>
+            <w:tcW w:w="2700" w:type="dxa"/>
             <w:tcMar>
               <w:top w:w="60" w:type="dxa"/>
               <w:left w:w="100" w:type="dxa"/>
@@ -5208,13 +4446,13 @@
               <w:rPr>
                 <w:sz w:val="18"/>
               </w:rPr>
-              <w:t xml:space="preserve">Pretrained fine-tune (v1)</w:t>
+              <w:t xml:space="preserve">Pretrained fine-tune (final model)</w:t>
             </w:r>
           </w:p>
         </w:tc>
         <w:tc>
           <w:tcPr>
-            <w:tcW w:w="1200" w:type="dxa"/>
+            <w:tcW w:w="1400" w:type="dxa"/>
             <w:tcMar>
               <w:top w:w="60" w:type="dxa"/>
               <w:left w:w="100" w:type="dxa"/>
@@ -5236,7 +4474,7 @@
         </w:tc>
         <w:tc>
           <w:tcPr>
-            <w:tcW w:w="1300" w:type="dxa"/>
+            <w:tcW w:w="1500" w:type="dxa"/>
             <w:tcMar>
               <w:top w:w="60" w:type="dxa"/>
               <w:left w:w="100" w:type="dxa"/>
@@ -5258,29 +4496,7 @@
         </w:tc>
         <w:tc>
           <w:tcPr>
-            <w:tcW w:w="1100" w:type="dxa"/>
-            <w:tcMar>
-              <w:top w:w="60" w:type="dxa"/>
-              <w:left w:w="100" w:type="dxa"/>
-              <w:bottom w:w="60" w:type="dxa"/>
-              <w:right w:w="100" w:type="dxa"/>
-            </w:tcMar>
-          </w:tcPr>
-          <w:p>
-            <w:pPr>
-              <w:jc w:val="right"/>
-            </w:pPr>
-            <w:r>
-              <w:rPr>
-                <w:sz w:val="18"/>
-              </w:rPr>
-              <w:t xml:space="preserve">0.019</w:t>
-            </w:r>
-          </w:p>
-        </w:tc>
-        <w:tc>
-          <w:tcPr>
-            <w:tcW w:w="1100" w:type="dxa"/>
+            <w:tcW w:w="1400" w:type="dxa"/>
             <w:tcMar>
               <w:top w:w="60" w:type="dxa"/>
               <w:left w:w="100" w:type="dxa"/>
@@ -5302,7 +4518,7 @@
         </w:tc>
         <w:tc>
           <w:tcPr>
-            <w:tcW w:w="1336" w:type="dxa"/>
+            <w:tcW w:w="1400" w:type="dxa"/>
             <w:tcMar>
               <w:top w:w="60" w:type="dxa"/>
               <w:left w:w="100" w:type="dxa"/>
@@ -5324,7 +4540,7 @@
         </w:tc>
         <w:tc>
           <w:tcPr>
-            <w:tcW w:w="1500" w:type="dxa"/>
+            <w:tcW w:w="1536" w:type="dxa"/>
             <w:tcMar>
               <w:top w:w="60" w:type="dxa"/>
               <w:left w:w="100" w:type="dxa"/>
@@ -5337,7 +4553,7 @@
               <w:rPr>
                 <w:sz w:val="18"/>
               </w:rPr>
-              <w:t xml:space="preserve">7 / 17</w:t>
+              <w:t xml:space="preserve">17 / 17</w:t>
             </w:r>
           </w:p>
         </w:tc>
@@ -5345,7 +4561,7 @@
       <w:tr>
         <w:tc>
           <w:tcPr>
-            <w:tcW w:w="2400" w:type="dxa"/>
+            <w:tcW w:w="2700" w:type="dxa"/>
             <w:tcMar>
               <w:top w:w="60" w:type="dxa"/>
               <w:left w:w="100" w:type="dxa"/>
@@ -5358,163 +4574,13 @@
               <w:rPr>
                 <w:sz w:val="18"/>
               </w:rPr>
-              <w:t xml:space="preserve">Pretrained fine-tune (v2 - alternate hyperparams, Phase 4)</w:t>
+              <w:t xml:space="preserve">Random-init scratch (no transfer learning)</w:t>
             </w:r>
           </w:p>
         </w:tc>
         <w:tc>
           <w:tcPr>
-            <w:tcW w:w="1200" w:type="dxa"/>
-            <w:tcMar>
-              <w:top w:w="60" w:type="dxa"/>
-              <w:left w:w="100" w:type="dxa"/>
-              <w:bottom w:w="60" w:type="dxa"/>
-              <w:right w:w="100" w:type="dxa"/>
-            </w:tcMar>
-          </w:tcPr>
-          <w:p>
-            <w:pPr>
-              <w:jc w:val="right"/>
-            </w:pPr>
-            <w:r>
-              <w:rPr>
-                <w:sz w:val="18"/>
-              </w:rPr>
-              <w:t xml:space="preserve">0.340</w:t>
-            </w:r>
-          </w:p>
-        </w:tc>
-        <w:tc>
-          <w:tcPr>
-            <w:tcW w:w="1300" w:type="dxa"/>
-            <w:tcMar>
-              <w:top w:w="60" w:type="dxa"/>
-              <w:left w:w="100" w:type="dxa"/>
-              <w:bottom w:w="60" w:type="dxa"/>
-              <w:right w:w="100" w:type="dxa"/>
-            </w:tcMar>
-          </w:tcPr>
-          <w:p>
-            <w:pPr>
-              <w:jc w:val="right"/>
-            </w:pPr>
-            <w:r>
-              <w:rPr>
-                <w:sz w:val="18"/>
-              </w:rPr>
-              <w:t xml:space="preserve">0.150</w:t>
-            </w:r>
-          </w:p>
-        </w:tc>
-        <w:tc>
-          <w:tcPr>
-            <w:tcW w:w="1100" w:type="dxa"/>
-            <w:tcMar>
-              <w:top w:w="60" w:type="dxa"/>
-              <w:left w:w="100" w:type="dxa"/>
-              <w:bottom w:w="60" w:type="dxa"/>
-              <w:right w:w="100" w:type="dxa"/>
-            </w:tcMar>
-          </w:tcPr>
-          <w:p>
-            <w:pPr>
-              <w:jc w:val="right"/>
-            </w:pPr>
-            <w:r>
-              <w:rPr>
-                <w:sz w:val="18"/>
-              </w:rPr>
-              <w:t xml:space="preserve">0.026</w:t>
-            </w:r>
-          </w:p>
-        </w:tc>
-        <w:tc>
-          <w:tcPr>
-            <w:tcW w:w="1100" w:type="dxa"/>
-            <w:tcMar>
-              <w:top w:w="60" w:type="dxa"/>
-              <w:left w:w="100" w:type="dxa"/>
-              <w:bottom w:w="60" w:type="dxa"/>
-              <w:right w:w="100" w:type="dxa"/>
-            </w:tcMar>
-          </w:tcPr>
-          <w:p>
-            <w:pPr>
-              <w:jc w:val="right"/>
-            </w:pPr>
-            <w:r>
-              <w:rPr>
-                <w:sz w:val="18"/>
-              </w:rPr>
-              <w:t xml:space="preserve">0.388</w:t>
-            </w:r>
-          </w:p>
-        </w:tc>
-        <w:tc>
-          <w:tcPr>
-            <w:tcW w:w="1336" w:type="dxa"/>
-            <w:tcMar>
-              <w:top w:w="60" w:type="dxa"/>
-              <w:left w:w="100" w:type="dxa"/>
-              <w:bottom w:w="60" w:type="dxa"/>
-              <w:right w:w="100" w:type="dxa"/>
-            </w:tcMar>
-          </w:tcPr>
-          <w:p>
-            <w:pPr>
-              <w:jc w:val="right"/>
-            </w:pPr>
-            <w:r>
-              <w:rPr>
-                <w:sz w:val="18"/>
-              </w:rPr>
-              <w:t xml:space="preserve">0.606</w:t>
-            </w:r>
-          </w:p>
-        </w:tc>
-        <w:tc>
-          <w:tcPr>
-            <w:tcW w:w="1500" w:type="dxa"/>
-            <w:tcMar>
-              <w:top w:w="60" w:type="dxa"/>
-              <w:left w:w="100" w:type="dxa"/>
-              <w:bottom w:w="60" w:type="dxa"/>
-              <w:right w:w="100" w:type="dxa"/>
-            </w:tcMar>
-          </w:tcPr>
-          <w:p>
-            <w:r>
-              <w:rPr>
-                <w:sz w:val="18"/>
-              </w:rPr>
-              <w:t xml:space="preserve">(not run with score formula)</w:t>
-            </w:r>
-          </w:p>
-        </w:tc>
-      </w:tr>
-      <w:tr>
-        <w:tc>
-          <w:tcPr>
-            <w:tcW w:w="2400" w:type="dxa"/>
-            <w:tcMar>
-              <w:top w:w="60" w:type="dxa"/>
-              <w:left w:w="100" w:type="dxa"/>
-              <w:bottom w:w="60" w:type="dxa"/>
-              <w:right w:w="100" w:type="dxa"/>
-            </w:tcMar>
-          </w:tcPr>
-          <w:p>
-            <w:r>
-              <w:rPr>
-                <w:sz w:val="18"/>
-              </w:rPr>
-              <w:t xml:space="preserve">Random-init scratch (Phase 2b)</w:t>
-            </w:r>
-          </w:p>
-        </w:tc>
-        <w:tc>
-          <w:tcPr>
-            <w:tcW w:w="1200" w:type="dxa"/>
+            <w:tcW w:w="1400" w:type="dxa"/>
             <w:tcMar>
               <w:top w:w="60" w:type="dxa"/>
               <w:left w:w="100" w:type="dxa"/>
@@ -5536,7 +4602,7 @@
         </w:tc>
         <w:tc>
           <w:tcPr>
-            <w:tcW w:w="1300" w:type="dxa"/>
+            <w:tcW w:w="1500" w:type="dxa"/>
             <w:tcMar>
               <w:top w:w="60" w:type="dxa"/>
               <w:left w:w="100" w:type="dxa"/>
@@ -5558,29 +4624,7 @@
         </w:tc>
         <w:tc>
           <w:tcPr>
-            <w:tcW w:w="1100" w:type="dxa"/>
-            <w:tcMar>
-              <w:top w:w="60" w:type="dxa"/>
-              <w:left w:w="100" w:type="dxa"/>
-              <w:bottom w:w="60" w:type="dxa"/>
-              <w:right w:w="100" w:type="dxa"/>
-            </w:tcMar>
-          </w:tcPr>
-          <w:p>
-            <w:pPr>
-              <w:jc w:val="right"/>
-            </w:pPr>
-            <w:r>
-              <w:rPr>
-                <w:sz w:val="18"/>
-              </w:rPr>
-              <w:t xml:space="preserve">0.0002</w:t>
-            </w:r>
-          </w:p>
-        </w:tc>
-        <w:tc>
-          <w:tcPr>
-            <w:tcW w:w="1100" w:type="dxa"/>
+            <w:tcW w:w="1400" w:type="dxa"/>
             <w:tcMar>
               <w:top w:w="60" w:type="dxa"/>
               <w:left w:w="100" w:type="dxa"/>
@@ -5602,7 +4646,7 @@
         </w:tc>
         <w:tc>
           <w:tcPr>
-            <w:tcW w:w="1336" w:type="dxa"/>
+            <w:tcW w:w="1400" w:type="dxa"/>
             <w:tcMar>
               <w:top w:w="60" w:type="dxa"/>
               <w:left w:w="100" w:type="dxa"/>
@@ -5624,7 +4668,7 @@
         </w:tc>
         <w:tc>
           <w:tcPr>
-            <w:tcW w:w="1500" w:type="dxa"/>
+            <w:tcW w:w="1536" w:type="dxa"/>
             <w:tcMar>
               <w:top w:w="60" w:type="dxa"/>
               <w:left w:w="100" w:type="dxa"/>
@@ -5637,7 +4681,7 @@
               <w:rPr>
                 <w:sz w:val="18"/>
               </w:rPr>
-              <w:t xml:space="preserve">4 / 17 (mostly artifact)</w:t>
+              <w:t xml:space="preserve">4 / 17</w:t>
             </w:r>
           </w:p>
         </w:tc>
@@ -5649,7 +4693,7 @@
         <w:rPr>
           <w:sz w:val="22"/>
         </w:rPr>
-        <w:t xml:space="preserve">Conclusion: pretrained ResNet-18 features are essential at this corpus size; from-scratch training on 110 images is insufficient (L08 s164-166 — “very different dataset, very little data” → fine-tune).</w:t>
+        <w:t xml:space="preserve">Fine-tuning from ImageNet-pretrained ResNet-18 is substantially better on every metric (mAP@0.5 = 0.367 vs 0.115, AP_bullseye = 0.736 vs 0.223, score in-band on SEEN = 17 / 17 vs 4 / 17), confirming the L08 s164-166 guidance to fine-tune on small specialised datasets. The pretrained fine-tune is the model used for all results in Section 4.</w:t>
       </w:r>
     </w:p>
     <w:sectPr>

</xml_diff>